<commit_message>
Add passing BDD coverage for chord finder
</commit_message>
<xml_diff>
--- a/chordFinderMidTermAveryJacobson.docx
+++ b/chordFinderMidTermAveryJacobson.docx
@@ -7,15 +7,13 @@
         <w:pStyle w:val="Heading1"/>
       </w:pPr>
       <w:bookmarkStart w:id="0" w:name="chordfinder"/>
-      <w:proofErr w:type="spellStart"/>
       <w:r>
         <w:t>ChordFinder</w:t>
       </w:r>
-      <w:proofErr w:type="spellEnd"/>
-    </w:p>
-    <w:p>
-      <w:pPr>
-        <w:pStyle w:val="CaptionedFigure"/>
+    </w:p>
+    <w:p>
+      <w:pPr>
+        <w:pStyle w:val="Heading2"/>
       </w:pPr>
       <w:bookmarkStart w:id="1" w:name="description"/>
       <w:r>
@@ -355,127 +353,8 @@
       <w:pPr>
         <w:pStyle w:val="Compact"/>
         <w:numPr>
-          <w:ilvl w:val="1"/>
-          <w:numId w:val="3"/>
-        </w:numPr>
-      </w:pPr>
-      <w:hyperlink w:anchor="design-decisions">
-        <w:r>
-          <w:rPr>
-            <w:rStyle w:val="Hyperlink"/>
-          </w:rPr>
-          <w:t>Design Decisions</w:t>
-        </w:r>
-      </w:hyperlink>
-    </w:p>
-    <w:p>
-      <w:pPr>
-        <w:pStyle w:val="Compact"/>
-        <w:numPr>
-          <w:ilvl w:val="1"/>
-          <w:numId w:val="3"/>
-        </w:numPr>
-      </w:pPr>
-      <w:hyperlink w:anchor="object-oriented-design-principles">
-        <w:r>
-          <w:rPr>
-            <w:rStyle w:val="Hyperlink"/>
-          </w:rPr>
-          <w:t>Object-Oriented Design Principles</w:t>
-        </w:r>
-      </w:hyperlink>
-    </w:p>
-    <w:p>
-      <w:pPr>
-        <w:pStyle w:val="Compact"/>
-        <w:numPr>
-          <w:ilvl w:val="1"/>
-          <w:numId w:val="3"/>
-        </w:numPr>
-      </w:pPr>
-      <w:hyperlink w:anchor="bdd-traceability-to-use-cases">
-        <w:r>
-          <w:rPr>
-            <w:rStyle w:val="Hyperlink"/>
-          </w:rPr>
-          <w:t>BDD Traceability to Use Cases</w:t>
-        </w:r>
-      </w:hyperlink>
-    </w:p>
-    <w:p>
-      <w:pPr>
-        <w:pStyle w:val="Compact"/>
-        <w:numPr>
           <w:ilvl w:val="2"/>
           <w:numId w:val="6"/>
-        </w:numPr>
-      </w:pPr>
-      <w:hyperlink w:anchor="find-chord-bdd-traceability">
-        <w:r>
-          <w:rPr>
-            <w:rStyle w:val="Hyperlink"/>
-          </w:rPr>
-          <w:t>Find Chord BDD Traceability</w:t>
-        </w:r>
-      </w:hyperlink>
-    </w:p>
-    <w:p>
-      <w:pPr>
-        <w:pStyle w:val="Compact"/>
-        <w:numPr>
-          <w:ilvl w:val="1"/>
-          <w:numId w:val="3"/>
-        </w:numPr>
-      </w:pPr>
-      <w:hyperlink w:anchor="X40b3badbb8d0753b77c5ebbeb01174d6a0f5276">
-        <w:r>
-          <w:rPr>
-            <w:rStyle w:val="Hyperlink"/>
-          </w:rPr>
-          <w:t>Behavior BDD Scenario</w:t>
-        </w:r>
-      </w:hyperlink>
-    </w:p>
-    <w:p>
-      <w:pPr>
-        <w:pStyle w:val="Compact"/>
-        <w:numPr>
-          <w:ilvl w:val="2"/>
-          <w:numId w:val="7"/>
-        </w:numPr>
-      </w:pPr>
-      <w:hyperlink w:anchor="maintain-chord-formula-bdd-traceability">
-        <w:r>
-          <w:rPr>
-            <w:rStyle w:val="Hyperlink"/>
-          </w:rPr>
-          <w:t>Maintain Chord Formula BDD Traceability</w:t>
-        </w:r>
-      </w:hyperlink>
-    </w:p>
-    <w:p>
-      <w:pPr>
-        <w:pStyle w:val="Compact"/>
-        <w:numPr>
-          <w:ilvl w:val="1"/>
-          <w:numId w:val="3"/>
-        </w:numPr>
-      </w:pPr>
-      <w:hyperlink w:anchor="X4423519109979c7550826b940892bd5cfe234e0">
-        <w:r>
-          <w:rPr>
-            <w:rStyle w:val="Hyperlink"/>
-          </w:rPr>
-          <w:t>Behavior BDD Scenario</w:t>
-        </w:r>
-      </w:hyperlink>
-    </w:p>
-    <w:p>
-      <w:pPr>
-        <w:pStyle w:val="Compact"/>
-        <w:numPr>
-          <w:ilvl w:val="2"/>
-          <w:numId w:val="8"/>
         </w:numPr>
       </w:pPr>
       <w:hyperlink w:anchor="bdd-scenarios">
@@ -526,7 +405,7 @@
         <w:pStyle w:val="Compact"/>
         <w:numPr>
           <w:ilvl w:val="2"/>
-          <w:numId w:val="9"/>
+          <w:numId w:val="7"/>
         </w:numPr>
       </w:pPr>
       <w:hyperlink w:anchor="traceability-summary">
@@ -560,7 +439,7 @@
         <w:pStyle w:val="Compact"/>
         <w:numPr>
           <w:ilvl w:val="2"/>
-          <w:numId w:val="10"/>
+          <w:numId w:val="8"/>
         </w:numPr>
       </w:pPr>
       <w:hyperlink w:anchor="prerequisites">
@@ -577,7 +456,7 @@
         <w:pStyle w:val="Compact"/>
         <w:numPr>
           <w:ilvl w:val="2"/>
-          <w:numId w:val="10"/>
+          <w:numId w:val="8"/>
         </w:numPr>
       </w:pPr>
       <w:hyperlink w:anchor="clone-the-project">
@@ -612,19 +491,19 @@
         <w:pStyle w:val="BodyText"/>
       </w:pPr>
       <w:r>
-        <w:t xml:space="preserve">The development process started with noun analysis and domain modeling. I reviewed the requirements and extracted important nouns such as ChordFinderSystem, ChordFormulaCatalog, ChordFormula, Chord, Note, chord name, pitch position, chord </w:t>
+        <w:t>The development process started with noun analysis and domain modeling. I reviewed the requirements and extracted important nouns such as ChordFinderSystem, ChordFormulaCatalog, ChordFormula, Chord, Note, chord name, pitch position, chord quality, administrator, and chord finder user. I then evaluated each noun by asking whether it represented a meaningful object with state, behavior, and responsibility within the system.</w:t>
+      </w:r>
+    </w:p>
+    <w:p>
+      <w:pPr>
+        <w:pStyle w:val="BodyText"/>
+      </w:pPr>
+      <w:r>
+        <w:t xml:space="preserve">The final domain model focused on five main classes: ChordFinderSystem, ChordFormulaCatalog, ChordFormula, Chord, and Note. Supporting ideas such as chord name, pitch position, formula intervals, chord quality, and display suffix were treated as attributes rather than separate classes. Actors such as Chord Finder User and </w:t>
       </w:r>
       <w:r>
         <w:lastRenderedPageBreak/>
-        <w:t>quality, administrator, and chord finder user. I then evaluated each noun by asking whether it represented a meaningful object with state, behavior, and responsibility within the system.</w:t>
-      </w:r>
-    </w:p>
-    <w:p>
-      <w:pPr>
-        <w:pStyle w:val="BodyText"/>
-      </w:pPr>
-      <w:r>
-        <w:t>The final domain model focused on five main classes: ChordFinderSystem, ChordFormulaCatalog, ChordFormula, Chord, and Note. Supporting ideas such as chord name, pitch position, formula intervals, chord quality, and display suffix were treated as attributes rather than separate classes. Actors such as Chord Finder User and Administrator were not modeled as domain classes because they interact with the system but are not objects the system needs to store or manage.</w:t>
+        <w:t>Administrator were not modeled as domain classes because they interact with the system but are not objects the system needs to store or manage.</w:t>
       </w:r>
     </w:p>
     <w:p>
@@ -682,15 +561,15 @@
         <w:pStyle w:val="BodyText"/>
       </w:pPr>
       <w:r>
+        <w:t>In a real client engagement, I would ask whether the system needs to support enharmonic equivalents, such as C# and Db, and how those should be displayed in the results. I would also ask whether the client wants the system to return one best chord name or all possible matching chord names. Another open question is whether administrators should be able to add completely new chord formulas, edit existing formulas, delete formulas, or only update a fixed list provided by the client.</w:t>
+      </w:r>
+    </w:p>
+    <w:p>
+      <w:pPr>
+        <w:pStyle w:val="BodyText"/>
+      </w:pPr>
+      <w:r>
         <w:lastRenderedPageBreak/>
-        <w:t>In a real client engagement, I would ask whether the system needs to support enharmonic equivalents, such as C# and Db, and how those should be displayed in the results. I would also ask whether the client wants the system to return one best chord name or all possible matching chord names. Another open question is whether administrators should be able to add completely new chord formulas, edit existing formulas, delete formulas, or only update a fixed list provided by the client.</w:t>
-      </w:r>
-    </w:p>
-    <w:p>
-      <w:pPr>
-        <w:pStyle w:val="BodyText"/>
-      </w:pPr>
-      <w:r>
         <w:t>Because the client was unavailable for further clarification, I made design decisions that keep the system small but flexible. I limited the first release to three-note chords, treated the Chord Finder User and Administrator as actors rather than domain classes, and kept chord formulas as maintained system data so the application can be updated without changing the main chord-finding logic.</w:t>
       </w:r>
     </w:p>
@@ -866,11 +745,7 @@
               <w:pStyle w:val="Compact"/>
             </w:pPr>
             <w:r>
-              <w:t xml:space="preserve">Considered whether ChordFinderSystem or a separate Administrator class should store </w:t>
-            </w:r>
-            <w:r>
-              <w:lastRenderedPageBreak/>
-              <w:t>administrator data. This would be useful if the system required login accounts, permissions, audit history, or different administrator roles.</w:t>
+              <w:t>Considered whether ChordFinderSystem or a separate Administrator class should store administrator data. This would be useful if the system required login accounts, permissions, audit history, or different administrator roles.</w:t>
             </w:r>
           </w:p>
         </w:tc>
@@ -883,12 +758,7 @@
               <w:pStyle w:val="Compact"/>
             </w:pPr>
             <w:r>
-              <w:lastRenderedPageBreak/>
-              <w:t xml:space="preserve">The administrator performs formula maintenance, but the prompt does not require storing administrator </w:t>
-            </w:r>
-            <w:r>
-              <w:lastRenderedPageBreak/>
-              <w:t>identity, login data, permissions, or history. Because the administrator is an external role interacting with the system, it is better represented as an actor.</w:t>
+              <w:t>The administrator performs formula maintenance, but the prompt does not require storing administrator identity, login data, permissions, or history. Because the administrator is an external role interacting with the system, it is better represented as an actor.</w:t>
             </w:r>
           </w:p>
         </w:tc>
@@ -1040,11 +910,11 @@
               <w:pStyle w:val="Compact"/>
             </w:pPr>
             <w:r>
-              <w:t xml:space="preserve">Considered whether ChordFinderSystem could return chord names as plain </w:t>
+              <w:t xml:space="preserve">Considered whether ChordFinderSystem could return chord names as plain text instead of creating Chord objects. Returning a string would be simpler, but it would lose the connection between the root note, formula, submitted notes, </w:t>
             </w:r>
             <w:r>
               <w:lastRenderedPageBreak/>
-              <w:t>text instead of creating Chord objects. Returning a string would be simpler, but it would lose the connection between the root note, formula, submitted notes, and generated chord name.</w:t>
+              <w:t>and generated chord name.</w:t>
             </w:r>
           </w:p>
         </w:tc>
@@ -1058,11 +928,7 @@
             </w:pPr>
             <w:r>
               <w:lastRenderedPageBreak/>
-              <w:t xml:space="preserve">A chord is the identified result of the system and connects a root note with a </w:t>
-            </w:r>
-            <w:r>
-              <w:lastRenderedPageBreak/>
-              <w:t>matching chord formula. This gives it enough meaning, state, and future flexibility to be modeled as a class instead of only a text result.</w:t>
+              <w:t>A chord is the identified result of the system and connects a root note with a matching chord formula. This gives it enough meaning, state, and future flexibility to be modeled as a class instead of only a text result.</w:t>
             </w:r>
           </w:p>
         </w:tc>
@@ -1077,7 +943,6 @@
               <w:pStyle w:val="Compact"/>
             </w:pPr>
             <w:r>
-              <w:lastRenderedPageBreak/>
               <w:t>Treat pitch position as an attribute of Note.</w:t>
             </w:r>
           </w:p>
@@ -1214,11 +1079,11 @@
               <w:pStyle w:val="Compact"/>
             </w:pPr>
             <w:r>
-              <w:t xml:space="preserve">Considered whether ChordFormula should support seventh chords, inversions, voicings, or other </w:t>
+              <w:t xml:space="preserve">Considered whether ChordFormula should support seventh chords, inversions, voicings, or other advanced chord types immediately. Those features would make the system more powerful, but they would also add complexity beyond the client’s initial </w:t>
             </w:r>
             <w:r>
               <w:lastRenderedPageBreak/>
-              <w:t>advanced chord types immediately. Those features would make the system more powerful, but they would also add complexity beyond the client’s initial request.</w:t>
+              <w:t>request.</w:t>
             </w:r>
           </w:p>
         </w:tc>
@@ -1232,11 +1097,11 @@
             </w:pPr>
             <w:r>
               <w:lastRenderedPageBreak/>
-              <w:t xml:space="preserve">The client’s initial problem is focused on identifying three-note chords. Limiting the release to triads keeps the </w:t>
+              <w:t xml:space="preserve">The client’s initial problem is focused on identifying three-note chords. Limiting the release to triads keeps the system small, understandable, and aligned with the stated requirements while still allowing formulas to be </w:t>
             </w:r>
             <w:r>
               <w:lastRenderedPageBreak/>
-              <w:t>system small, understandable, and aligned with the stated requirements while still allowing formulas to be extended later.</w:t>
+              <w:t>extended later.</w:t>
             </w:r>
           </w:p>
         </w:tc>
@@ -1388,11 +1253,11 @@
               <w:pStyle w:val="Compact"/>
             </w:pPr>
             <w:r>
-              <w:t xml:space="preserve">Considered whether ChordFinderSystem should simply associate with formulas or directly own them. Direct ownership by </w:t>
+              <w:t xml:space="preserve">Considered whether ChordFinderSystem should simply associate with formulas or directly own them. Direct ownership by ChordFinderSystem would work, but it would weaken the purpose of the catalog and make formula management less clearly </w:t>
             </w:r>
             <w:r>
               <w:lastRenderedPageBreak/>
-              <w:t>ChordFinderSystem would work, but it would weaken the purpose of the catalog and make formula management less clearly separated.</w:t>
+              <w:t>separated.</w:t>
             </w:r>
           </w:p>
         </w:tc>
@@ -1406,11 +1271,11 @@
             </w:pPr>
             <w:r>
               <w:lastRenderedPageBreak/>
-              <w:t xml:space="preserve">The catalog manages a collection of chord formulas, so aggregation best represents the whole-part relationship in this </w:t>
+              <w:t xml:space="preserve">The catalog manages a collection of chord formulas, so aggregation best represents the whole-part relationship in this model. This shows that formulas belong to the maintained catalog and supports the design choice to keep formula maintenance separate from </w:t>
             </w:r>
             <w:r>
               <w:lastRenderedPageBreak/>
-              <w:t>model. This shows that formulas belong to the maintained catalog and supports the design choice to keep formula maintenance separate from chord identification.</w:t>
+              <w:t>chord identification.</w:t>
             </w:r>
           </w:p>
         </w:tc>
@@ -1436,8 +1301,8 @@
           <w:noProof/>
         </w:rPr>
         <w:drawing>
-          <wp:inline distT="0" distB="0" distL="0" distR="0" wp14:anchorId="55D6931E" wp14:editId="3C770405">
-            <wp:extent cx="5274310" cy="7418567"/>
+          <wp:inline distT="0" distB="0" distL="0" distR="0" wp14:anchorId="5EB61A70" wp14:editId="523F87D8">
+            <wp:extent cx="5274310" cy="7521934"/>
             <wp:effectExtent l="0" t="0" r="0" b="0"/>
             <wp:docPr id="19" name="Picture" descr="alt text"/>
             <wp:cNvGraphicFramePr/>
@@ -1459,7 +1324,7 @@
                   <pic:spPr bwMode="auto">
                     <a:xfrm>
                       <a:off x="0" y="0"/>
-                      <a:ext cx="5275865" cy="7420754"/>
+                      <a:ext cx="5276680" cy="7525314"/>
                     </a:xfrm>
                     <a:prstGeom prst="rect">
                       <a:avLst/>
@@ -1483,7 +1348,7 @@
         <w:pStyle w:val="ImageCaption"/>
       </w:pPr>
       <w:r>
-        <w:t>s</w:t>
+        <w:t>alt text</w:t>
       </w:r>
     </w:p>
     <w:p>
@@ -1595,7 +1460,7 @@
         </w:rPr>
         <w:lastRenderedPageBreak/>
         <w:drawing>
-          <wp:inline distT="0" distB="0" distL="0" distR="0" wp14:anchorId="55D69320" wp14:editId="55D69321">
+          <wp:inline distT="0" distB="0" distL="0" distR="0" wp14:anchorId="13B21BF4" wp14:editId="32E71943">
             <wp:extent cx="2704698" cy="7122694"/>
             <wp:effectExtent l="0" t="0" r="0" b="0"/>
             <wp:docPr id="23" name="Picture" descr="alt text"/>
@@ -1638,16 +1503,6 @@
       </w:r>
     </w:p>
     <w:p>
-      <w:r>
-        <w:br w:type="page"/>
-      </w:r>
-    </w:p>
-    <w:p>
-      <w:pPr>
-        <w:pStyle w:val="CaptionedFigure"/>
-      </w:pPr>
-    </w:p>
-    <w:p>
       <w:pPr>
         <w:pStyle w:val="Heading2"/>
       </w:pPr>
@@ -1673,8 +1528,9 @@
         <w:rPr>
           <w:noProof/>
         </w:rPr>
+        <w:lastRenderedPageBreak/>
         <w:drawing>
-          <wp:inline distT="0" distB="0" distL="0" distR="0" wp14:anchorId="55D69322" wp14:editId="55D69323">
+          <wp:inline distT="0" distB="0" distL="0" distR="0" wp14:anchorId="66C0ECF7" wp14:editId="124FA077">
             <wp:extent cx="5334000" cy="2695936"/>
             <wp:effectExtent l="0" t="0" r="0" b="0"/>
             <wp:docPr id="27" name="Picture" descr="alt text"/>
@@ -1759,7 +1615,7 @@
         </w:rPr>
         <w:lastRenderedPageBreak/>
         <w:drawing>
-          <wp:inline distT="0" distB="0" distL="0" distR="0" wp14:anchorId="55D69324" wp14:editId="55D69325">
+          <wp:inline distT="0" distB="0" distL="0" distR="0" wp14:anchorId="13CBBBD1" wp14:editId="09F0F874">
             <wp:extent cx="4870383" cy="6824311"/>
             <wp:effectExtent l="0" t="0" r="0" b="0"/>
             <wp:docPr id="30" name="Picture" descr="alt text"/>
@@ -1803,6 +1659,14 @@
     </w:p>
     <w:p>
       <w:pPr>
+        <w:pStyle w:val="ImageCaption"/>
+      </w:pPr>
+      <w:r>
+        <w:t>alt text</w:t>
+      </w:r>
+    </w:p>
+    <w:p>
+      <w:pPr>
         <w:pStyle w:val="CaptionedFigure"/>
       </w:pPr>
       <w:r>
@@ -1811,7 +1675,7 @@
         </w:rPr>
         <w:lastRenderedPageBreak/>
         <w:drawing>
-          <wp:inline distT="0" distB="0" distL="0" distR="0" wp14:anchorId="55D69326" wp14:editId="55D69327">
+          <wp:inline distT="0" distB="0" distL="0" distR="0" wp14:anchorId="7C781E1A" wp14:editId="2727D2D8">
             <wp:extent cx="5334000" cy="3241922"/>
             <wp:effectExtent l="0" t="0" r="0" b="0"/>
             <wp:docPr id="33" name="Picture" descr="alt text"/>
@@ -1870,7 +1734,7 @@
           <w:noProof/>
         </w:rPr>
         <w:drawing>
-          <wp:inline distT="0" distB="0" distL="0" distR="0" wp14:anchorId="55D69328" wp14:editId="55D69329">
+          <wp:inline distT="0" distB="0" distL="0" distR="0" wp14:anchorId="3DD064A3" wp14:editId="7EB19595">
             <wp:extent cx="5334000" cy="2413191"/>
             <wp:effectExtent l="0" t="0" r="0" b="0"/>
             <wp:docPr id="36" name="Picture" descr="alt text"/>
@@ -1933,7 +1797,7 @@
         <w:pStyle w:val="Compact"/>
         <w:numPr>
           <w:ilvl w:val="0"/>
-          <w:numId w:val="11"/>
+          <w:numId w:val="9"/>
         </w:numPr>
       </w:pPr>
       <w:r>
@@ -1945,7 +1809,7 @@
         <w:pStyle w:val="Compact"/>
         <w:numPr>
           <w:ilvl w:val="0"/>
-          <w:numId w:val="11"/>
+          <w:numId w:val="9"/>
         </w:numPr>
       </w:pPr>
       <w:r>
@@ -1957,7 +1821,7 @@
         <w:pStyle w:val="Compact"/>
         <w:numPr>
           <w:ilvl w:val="0"/>
-          <w:numId w:val="11"/>
+          <w:numId w:val="9"/>
         </w:numPr>
       </w:pPr>
       <w:r>
@@ -1969,7 +1833,7 @@
         <w:pStyle w:val="Compact"/>
         <w:numPr>
           <w:ilvl w:val="0"/>
-          <w:numId w:val="11"/>
+          <w:numId w:val="9"/>
         </w:numPr>
       </w:pPr>
       <w:r>
@@ -1981,7 +1845,7 @@
         <w:pStyle w:val="Compact"/>
         <w:numPr>
           <w:ilvl w:val="0"/>
-          <w:numId w:val="11"/>
+          <w:numId w:val="9"/>
         </w:numPr>
       </w:pPr>
       <w:r>
@@ -2036,7 +1900,7 @@
         <w:pStyle w:val="Compact"/>
         <w:numPr>
           <w:ilvl w:val="0"/>
-          <w:numId w:val="12"/>
+          <w:numId w:val="10"/>
         </w:numPr>
       </w:pPr>
       <w:r>
@@ -2048,7 +1912,7 @@
         <w:pStyle w:val="Compact"/>
         <w:numPr>
           <w:ilvl w:val="0"/>
-          <w:numId w:val="12"/>
+          <w:numId w:val="10"/>
         </w:numPr>
       </w:pPr>
       <w:r>
@@ -2060,7 +1924,7 @@
         <w:pStyle w:val="Compact"/>
         <w:numPr>
           <w:ilvl w:val="0"/>
-          <w:numId w:val="12"/>
+          <w:numId w:val="10"/>
         </w:numPr>
       </w:pPr>
       <w:r>
@@ -2072,7 +1936,7 @@
         <w:pStyle w:val="Compact"/>
         <w:numPr>
           <w:ilvl w:val="0"/>
-          <w:numId w:val="12"/>
+          <w:numId w:val="10"/>
         </w:numPr>
       </w:pPr>
       <w:r>
@@ -2089,7 +1953,7 @@
         </w:rPr>
         <w:lastRenderedPageBreak/>
         <w:drawing>
-          <wp:inline distT="0" distB="0" distL="0" distR="0" wp14:anchorId="55D6932A" wp14:editId="55D6932B">
+          <wp:inline distT="0" distB="0" distL="0" distR="0" wp14:anchorId="7DC46332" wp14:editId="721E6EEB">
             <wp:extent cx="4908884" cy="8335477"/>
             <wp:effectExtent l="0" t="0" r="0" b="0"/>
             <wp:docPr id="40" name="Picture" descr="alt text"/>
@@ -2139,7 +2003,7 @@
         </w:rPr>
         <w:lastRenderedPageBreak/>
         <w:drawing>
-          <wp:inline distT="0" distB="0" distL="0" distR="0" wp14:anchorId="55D6932C" wp14:editId="55D6932D">
+          <wp:inline distT="0" distB="0" distL="0" distR="0" wp14:anchorId="14923405" wp14:editId="47E26707">
             <wp:extent cx="4976261" cy="6237170"/>
             <wp:effectExtent l="0" t="0" r="0" b="0"/>
             <wp:docPr id="43" name="Picture" descr="alt text"/>
@@ -2189,7 +2053,7 @@
         </w:rPr>
         <w:lastRenderedPageBreak/>
         <w:drawing>
-          <wp:inline distT="0" distB="0" distL="0" distR="0" wp14:anchorId="55D6932E" wp14:editId="55D6932F">
+          <wp:inline distT="0" distB="0" distL="0" distR="0" wp14:anchorId="53974EC2" wp14:editId="6EB552CC">
             <wp:extent cx="5334000" cy="3360243"/>
             <wp:effectExtent l="0" t="0" r="0" b="0"/>
             <wp:docPr id="46" name="Picture" descr="alt text"/>
@@ -2238,7 +2102,7 @@
           <w:noProof/>
         </w:rPr>
         <w:drawing>
-          <wp:inline distT="0" distB="0" distL="0" distR="0" wp14:anchorId="55D69330" wp14:editId="55D69331">
+          <wp:inline distT="0" distB="0" distL="0" distR="0" wp14:anchorId="3D3652A5" wp14:editId="680D6B91">
             <wp:extent cx="5334000" cy="2073133"/>
             <wp:effectExtent l="0" t="0" r="0" b="0"/>
             <wp:docPr id="49" name="Picture" descr="alt text"/>
@@ -2300,10 +2164,9 @@
         <w:rPr>
           <w:noProof/>
         </w:rPr>
-        <w:lastRenderedPageBreak/>
         <w:drawing>
-          <wp:inline distT="0" distB="0" distL="0" distR="0" wp14:anchorId="55D69332" wp14:editId="55D69333">
-            <wp:extent cx="4485372" cy="8248850"/>
+          <wp:inline distT="0" distB="0" distL="0" distR="0" wp14:anchorId="65E47B88" wp14:editId="2D617BC5">
+            <wp:extent cx="4485005" cy="7867650"/>
             <wp:effectExtent l="0" t="0" r="0" b="0"/>
             <wp:docPr id="54" name="Picture" descr="alt text"/>
             <wp:cNvGraphicFramePr/>
@@ -2325,7 +2188,7 @@
                   <pic:spPr bwMode="auto">
                     <a:xfrm>
                       <a:off x="0" y="0"/>
-                      <a:ext cx="4485372" cy="8248850"/>
+                      <a:ext cx="4485373" cy="7868295"/>
                     </a:xfrm>
                     <a:prstGeom prst="rect">
                       <a:avLst/>
@@ -2366,11 +2229,225 @@
       <w:pPr>
         <w:numPr>
           <w:ilvl w:val="0"/>
-          <w:numId w:val="13"/>
+          <w:numId w:val="11"/>
         </w:numPr>
       </w:pPr>
       <w:r>
         <w:t>chordFormulaCatalog : ChordFormulaCatalog</w:t>
+      </w:r>
+    </w:p>
+    <w:p>
+      <w:pPr>
+        <w:numPr>
+          <w:ilvl w:val="0"/>
+          <w:numId w:val="11"/>
+        </w:numPr>
+      </w:pPr>
+      <w:r>
+        <w:t>submittedNotes : List</w:t>
+      </w:r>
+    </w:p>
+    <w:p>
+      <w:pPr>
+        <w:numPr>
+          <w:ilvl w:val="0"/>
+          <w:numId w:val="11"/>
+        </w:numPr>
+      </w:pPr>
+      <w:r>
+        <w:t>identifiedChords : List</w:t>
+      </w:r>
+    </w:p>
+    <w:p>
+      <w:pPr>
+        <w:numPr>
+          <w:ilvl w:val="0"/>
+          <w:numId w:val="11"/>
+        </w:numPr>
+      </w:pPr>
+      <w:r>
+        <w:t>resultMessage : String</w:t>
+      </w:r>
+    </w:p>
+    <w:p>
+      <w:pPr>
+        <w:numPr>
+          <w:ilvl w:val="0"/>
+          <w:numId w:val="11"/>
+        </w:numPr>
+      </w:pPr>
+      <w:r>
+        <w:t>identifyChord(submittedNoteText : String) : List</w:t>
+      </w:r>
+    </w:p>
+    <w:p>
+      <w:pPr>
+        <w:numPr>
+          <w:ilvl w:val="0"/>
+          <w:numId w:val="11"/>
+        </w:numPr>
+      </w:pPr>
+      <w:r>
+        <w:t>validateNotes(submittedNoteText : String) : List</w:t>
+      </w:r>
+    </w:p>
+    <w:p>
+      <w:pPr>
+        <w:numPr>
+          <w:ilvl w:val="0"/>
+          <w:numId w:val="11"/>
+        </w:numPr>
+      </w:pPr>
+      <w:r>
+        <w:t>defineChordFormula(formula : ChordFormula) : void</w:t>
+      </w:r>
+    </w:p>
+    <w:p>
+      <w:pPr>
+        <w:numPr>
+          <w:ilvl w:val="0"/>
+          <w:numId w:val="11"/>
+        </w:numPr>
+      </w:pPr>
+      <w:r>
+        <w:t>editChordFormula(qualityName : String, revisedFormula : ChordFormula) : void</w:t>
+      </w:r>
+    </w:p>
+    <w:p>
+      <w:pPr>
+        <w:numPr>
+          <w:ilvl w:val="0"/>
+          <w:numId w:val="11"/>
+        </w:numPr>
+      </w:pPr>
+      <w:r>
+        <w:t>deleteChordFormula(qualityName : String) : boolean</w:t>
+      </w:r>
+    </w:p>
+    <w:p>
+      <w:pPr>
+        <w:numPr>
+          <w:ilvl w:val="0"/>
+          <w:numId w:val="11"/>
+        </w:numPr>
+      </w:pPr>
+      <w:r>
+        <w:t>getChordFormulas() : List</w:t>
+      </w:r>
+    </w:p>
+    <w:p>
+      <w:pPr>
+        <w:numPr>
+          <w:ilvl w:val="0"/>
+          <w:numId w:val="11"/>
+        </w:numPr>
+      </w:pPr>
+      <w:r>
+        <w:t>displayResult() : void</w:t>
+      </w:r>
+    </w:p>
+    <w:p>
+      <w:pPr>
+        <w:numPr>
+          <w:ilvl w:val="0"/>
+          <w:numId w:val="11"/>
+        </w:numPr>
+      </w:pPr>
+      <w:r>
+        <w:t>getChordFormulaCatalog() : ChordFormulaCatalog</w:t>
+      </w:r>
+    </w:p>
+    <w:p>
+      <w:pPr>
+        <w:numPr>
+          <w:ilvl w:val="0"/>
+          <w:numId w:val="11"/>
+        </w:numPr>
+      </w:pPr>
+      <w:r>
+        <w:t>getResultMessage() : String</w:t>
+      </w:r>
+    </w:p>
+    <w:p>
+      <w:pPr>
+        <w:pStyle w:val="FirstParagraph"/>
+      </w:pPr>
+      <w:r>
+        <w:t>Class: ChordFormulaCatalog</w:t>
+      </w:r>
+    </w:p>
+    <w:p>
+      <w:pPr>
+        <w:numPr>
+          <w:ilvl w:val="0"/>
+          <w:numId w:val="12"/>
+        </w:numPr>
+      </w:pPr>
+      <w:r>
+        <w:t>chordFormulas : List</w:t>
+      </w:r>
+    </w:p>
+    <w:p>
+      <w:pPr>
+        <w:numPr>
+          <w:ilvl w:val="0"/>
+          <w:numId w:val="12"/>
+        </w:numPr>
+      </w:pPr>
+      <w:r>
+        <w:t>defineChordFormula(formula : ChordFormula) : void</w:t>
+      </w:r>
+    </w:p>
+    <w:p>
+      <w:pPr>
+        <w:numPr>
+          <w:ilvl w:val="0"/>
+          <w:numId w:val="12"/>
+        </w:numPr>
+      </w:pPr>
+      <w:r>
+        <w:t>editChordFormula(qualityName : String, revisedFormula : ChordFormula) : boolean</w:t>
+      </w:r>
+    </w:p>
+    <w:p>
+      <w:pPr>
+        <w:numPr>
+          <w:ilvl w:val="0"/>
+          <w:numId w:val="12"/>
+        </w:numPr>
+      </w:pPr>
+      <w:r>
+        <w:t>deleteChordFormula(qualityName : String) : boolean</w:t>
+      </w:r>
+    </w:p>
+    <w:p>
+      <w:pPr>
+        <w:numPr>
+          <w:ilvl w:val="0"/>
+          <w:numId w:val="12"/>
+        </w:numPr>
+      </w:pPr>
+      <w:r>
+        <w:t>getChordFormulas() : List</w:t>
+      </w:r>
+    </w:p>
+    <w:p>
+      <w:pPr>
+        <w:numPr>
+          <w:ilvl w:val="0"/>
+          <w:numId w:val="12"/>
+        </w:numPr>
+      </w:pPr>
+      <w:r>
+        <w:t>findFormula(qualityName : String) : ChordFormula</w:t>
+      </w:r>
+    </w:p>
+    <w:p>
+      <w:pPr>
+        <w:pStyle w:val="FirstParagraph"/>
+      </w:pPr>
+      <w:r>
+        <w:t>Class: ChordFormula</w:t>
       </w:r>
     </w:p>
     <w:p>
@@ -2381,7 +2458,7 @@
         </w:numPr>
       </w:pPr>
       <w:r>
-        <w:t>submittedNotes : List</w:t>
+        <w:t>qualityName : String</w:t>
       </w:r>
     </w:p>
     <w:p>
@@ -2392,7 +2469,7 @@
         </w:numPr>
       </w:pPr>
       <w:r>
-        <w:t>identifiedChords : List</w:t>
+        <w:t>displaySuffix : String</w:t>
       </w:r>
     </w:p>
     <w:p>
@@ -2403,7 +2480,7 @@
         </w:numPr>
       </w:pPr>
       <w:r>
-        <w:t>resultMessage : String</w:t>
+        <w:t>rootToThird : int</w:t>
       </w:r>
     </w:p>
     <w:p>
@@ -2414,7 +2491,8 @@
         </w:numPr>
       </w:pPr>
       <w:r>
-        <w:t>identifyChord(submittedNoteText : String) : List</w:t>
+        <w:lastRenderedPageBreak/>
+        <w:t>rootToFifth : int</w:t>
       </w:r>
     </w:p>
     <w:p>
@@ -2425,7 +2503,18 @@
         </w:numPr>
       </w:pPr>
       <w:r>
-        <w:t>validateNotes(submittedNoteText : String) : List</w:t>
+        <w:t>matchesNotes(rootNote : Note, submittedNotes : List</w:t>
+      </w:r>
+    </w:p>
+    <w:p>
+      <w:pPr>
+        <w:numPr>
+          <w:ilvl w:val="0"/>
+          <w:numId w:val="1"/>
+        </w:numPr>
+      </w:pPr>
+      <w:r>
+        <w:t>) : boolean</w:t>
       </w:r>
     </w:p>
     <w:p>
@@ -2436,7 +2525,7 @@
         </w:numPr>
       </w:pPr>
       <w:r>
-        <w:t>defineChordFormula(formula : ChordFormula) : void</w:t>
+        <w:t>updateFormula(qualityName : String, displaySuffix : String, rootToThird : int, rootToFifth : int) : void</w:t>
       </w:r>
     </w:p>
     <w:p>
@@ -2447,7 +2536,7 @@
         </w:numPr>
       </w:pPr>
       <w:r>
-        <w:t>editChordFormula(qualityName : String, revisedFormula : ChordFormula) : void</w:t>
+        <w:t>getQualityName() : String</w:t>
       </w:r>
     </w:p>
     <w:p>
@@ -2458,7 +2547,7 @@
         </w:numPr>
       </w:pPr>
       <w:r>
-        <w:t>deleteChordFormula(qualityName : String) : boolean</w:t>
+        <w:t>getDisplaySuffix() : String</w:t>
       </w:r>
     </w:p>
     <w:p>
@@ -2469,7 +2558,7 @@
         </w:numPr>
       </w:pPr>
       <w:r>
-        <w:t>getChordFormulas() : List</w:t>
+        <w:t>getRootToThird() : int</w:t>
       </w:r>
     </w:p>
     <w:p>
@@ -2480,29 +2569,7 @@
         </w:numPr>
       </w:pPr>
       <w:r>
-        <w:t>displayResult() : void</w:t>
-      </w:r>
-    </w:p>
-    <w:p>
-      <w:pPr>
-        <w:numPr>
-          <w:ilvl w:val="0"/>
-          <w:numId w:val="13"/>
-        </w:numPr>
-      </w:pPr>
-      <w:r>
-        <w:t>getChordFormulaCatalog() : ChordFormulaCatalog</w:t>
-      </w:r>
-    </w:p>
-    <w:p>
-      <w:pPr>
-        <w:numPr>
-          <w:ilvl w:val="0"/>
-          <w:numId w:val="13"/>
-        </w:numPr>
-      </w:pPr>
-      <w:r>
-        <w:t>getResultMessage() : String</w:t>
+        <w:t>getRootToFifth() : int</w:t>
       </w:r>
     </w:p>
     <w:p>
@@ -2510,7 +2577,7 @@
         <w:pStyle w:val="FirstParagraph"/>
       </w:pPr>
       <w:r>
-        <w:t>Class: ChordFormulaCatalog</w:t>
+        <w:t>Class: Chord</w:t>
       </w:r>
     </w:p>
     <w:p>
@@ -2521,7 +2588,7 @@
         </w:numPr>
       </w:pPr>
       <w:r>
-        <w:t>chordFormulas : List</w:t>
+        <w:t>rootNote : Note</w:t>
       </w:r>
     </w:p>
     <w:p>
@@ -2532,7 +2599,7 @@
         </w:numPr>
       </w:pPr>
       <w:r>
-        <w:t>defineChordFormula(formula : ChordFormula) : void</w:t>
+        <w:t>chordFormula : ChordFormula</w:t>
       </w:r>
     </w:p>
     <w:p>
@@ -2543,7 +2610,7 @@
         </w:numPr>
       </w:pPr>
       <w:r>
-        <w:t>editChordFormula(qualityName : String, revisedFormula : ChordFormula) : boolean</w:t>
+        <w:t>notes : List</w:t>
       </w:r>
     </w:p>
     <w:p>
@@ -2554,7 +2621,7 @@
         </w:numPr>
       </w:pPr>
       <w:r>
-        <w:t>deleteChordFormula(qualityName : String) : boolean</w:t>
+        <w:t>chordName : String</w:t>
       </w:r>
     </w:p>
     <w:p>
@@ -2565,7 +2632,7 @@
         </w:numPr>
       </w:pPr>
       <w:r>
-        <w:t>getChordFormulas() : List</w:t>
+        <w:t>getChordName() : String</w:t>
       </w:r>
     </w:p>
     <w:p>
@@ -2576,7 +2643,29 @@
         </w:numPr>
       </w:pPr>
       <w:r>
-        <w:t>findFormula(qualityName : String) : ChordFormula</w:t>
+        <w:t>getRootNote() : Note</w:t>
+      </w:r>
+    </w:p>
+    <w:p>
+      <w:pPr>
+        <w:numPr>
+          <w:ilvl w:val="0"/>
+          <w:numId w:val="14"/>
+        </w:numPr>
+      </w:pPr>
+      <w:r>
+        <w:t>getChordFormula() : ChordFormula</w:t>
+      </w:r>
+    </w:p>
+    <w:p>
+      <w:pPr>
+        <w:numPr>
+          <w:ilvl w:val="0"/>
+          <w:numId w:val="14"/>
+        </w:numPr>
+      </w:pPr>
+      <w:r>
+        <w:t>getNotes() : List</w:t>
       </w:r>
     </w:p>
     <w:p>
@@ -2584,7 +2673,7 @@
         <w:pStyle w:val="FirstParagraph"/>
       </w:pPr>
       <w:r>
-        <w:t>Class: ChordFormula</w:t>
+        <w:t>Class: Note</w:t>
       </w:r>
     </w:p>
     <w:p>
@@ -2595,7 +2684,7 @@
         </w:numPr>
       </w:pPr>
       <w:r>
-        <w:t>qualityName : String</w:t>
+        <w:t>spelling : String</w:t>
       </w:r>
     </w:p>
     <w:p>
@@ -2606,7 +2695,7 @@
         </w:numPr>
       </w:pPr>
       <w:r>
-        <w:t>displaySuffix : String</w:t>
+        <w:t>pitchPosition : int</w:t>
       </w:r>
     </w:p>
     <w:p>
@@ -2617,7 +2706,7 @@
         </w:numPr>
       </w:pPr>
       <w:r>
-        <w:t>rootToThird : int</w:t>
+        <w:t>sharpName : String</w:t>
       </w:r>
     </w:p>
     <w:p>
@@ -2628,8 +2717,7 @@
         </w:numPr>
       </w:pPr>
       <w:r>
-        <w:lastRenderedPageBreak/>
-        <w:t>rootToFifth : int</w:t>
+        <w:t>flatName : String</w:t>
       </w:r>
     </w:p>
     <w:p>
@@ -2640,18 +2728,7 @@
         </w:numPr>
       </w:pPr>
       <w:r>
-        <w:t>matchesNotes(rootNote : Note, submittedNotes : List</w:t>
-      </w:r>
-    </w:p>
-    <w:p>
-      <w:pPr>
-        <w:numPr>
-          <w:ilvl w:val="0"/>
-          <w:numId w:val="1"/>
-        </w:numPr>
-      </w:pPr>
-      <w:r>
-        <w:t>) : boolean</w:t>
+        <w:t>otherNames : List</w:t>
       </w:r>
     </w:p>
     <w:p>
@@ -2662,7 +2739,7 @@
         </w:numPr>
       </w:pPr>
       <w:r>
-        <w:t>updateFormula(qualityName : String, displaySuffix : String, rootToThird : int, rootToFifth : int) : void</w:t>
+        <w:t>from(noteText : String) : Note</w:t>
       </w:r>
     </w:p>
     <w:p>
@@ -2673,7 +2750,7 @@
         </w:numPr>
       </w:pPr>
       <w:r>
-        <w:t>getQualityName() : String</w:t>
+        <w:t>isValid(noteText : String) : boolean</w:t>
       </w:r>
     </w:p>
     <w:p>
@@ -2684,7 +2761,8 @@
         </w:numPr>
       </w:pPr>
       <w:r>
-        <w:t>getDisplaySuffix() : String</w:t>
+        <w:lastRenderedPageBreak/>
+        <w:t>isValid() : boolean</w:t>
       </w:r>
     </w:p>
     <w:p>
@@ -2695,7 +2773,7 @@
         </w:numPr>
       </w:pPr>
       <w:r>
-        <w:t>getRootToThird() : int</w:t>
+        <w:t>distanceTo(otherNote : Note) : int</w:t>
       </w:r>
     </w:p>
     <w:p>
@@ -2706,384 +2784,51 @@
         </w:numPr>
       </w:pPr>
       <w:r>
-        <w:t>getRootToFifth() : int</w:t>
-      </w:r>
-    </w:p>
-    <w:p>
-      <w:pPr>
-        <w:pStyle w:val="FirstParagraph"/>
-      </w:pPr>
-      <w:r>
-        <w:t>Class: Chord</w:t>
+        <w:t>getSpelling() : String</w:t>
       </w:r>
     </w:p>
     <w:p>
       <w:pPr>
         <w:numPr>
           <w:ilvl w:val="0"/>
-          <w:numId w:val="16"/>
-        </w:numPr>
-      </w:pPr>
-      <w:r>
-        <w:t>rootNote : Note</w:t>
+          <w:numId w:val="15"/>
+        </w:numPr>
+      </w:pPr>
+      <w:r>
+        <w:t>getPitchPosition() : int</w:t>
       </w:r>
     </w:p>
     <w:p>
       <w:pPr>
         <w:numPr>
           <w:ilvl w:val="0"/>
-          <w:numId w:val="16"/>
-        </w:numPr>
-      </w:pPr>
-      <w:r>
-        <w:t>chordFormula : ChordFormula</w:t>
+          <w:numId w:val="15"/>
+        </w:numPr>
+      </w:pPr>
+      <w:r>
+        <w:t>getSharpName() : String</w:t>
       </w:r>
     </w:p>
     <w:p>
       <w:pPr>
         <w:numPr>
           <w:ilvl w:val="0"/>
-          <w:numId w:val="16"/>
-        </w:numPr>
-      </w:pPr>
-      <w:r>
-        <w:t>notes : List</w:t>
+          <w:numId w:val="15"/>
+        </w:numPr>
+      </w:pPr>
+      <w:r>
+        <w:t>getFlatName() : String</w:t>
       </w:r>
     </w:p>
     <w:p>
       <w:pPr>
         <w:numPr>
           <w:ilvl w:val="0"/>
-          <w:numId w:val="16"/>
-        </w:numPr>
-      </w:pPr>
-      <w:r>
-        <w:t>chordName : String</w:t>
-      </w:r>
-    </w:p>
-    <w:p>
-      <w:pPr>
-        <w:numPr>
-          <w:ilvl w:val="0"/>
-          <w:numId w:val="16"/>
-        </w:numPr>
-      </w:pPr>
-      <w:r>
-        <w:t>getChordName() : String</w:t>
-      </w:r>
-    </w:p>
-    <w:p>
-      <w:pPr>
-        <w:numPr>
-          <w:ilvl w:val="0"/>
-          <w:numId w:val="16"/>
-        </w:numPr>
-      </w:pPr>
-      <w:r>
-        <w:t>getRootNote() : Note</w:t>
-      </w:r>
-    </w:p>
-    <w:p>
-      <w:pPr>
-        <w:numPr>
-          <w:ilvl w:val="0"/>
-          <w:numId w:val="16"/>
-        </w:numPr>
-      </w:pPr>
-      <w:r>
-        <w:t>getChordFormula() : ChordFormula</w:t>
-      </w:r>
-    </w:p>
-    <w:p>
-      <w:pPr>
-        <w:numPr>
-          <w:ilvl w:val="0"/>
-          <w:numId w:val="16"/>
-        </w:numPr>
-      </w:pPr>
-      <w:r>
-        <w:t>getNotes() : List</w:t>
-      </w:r>
-    </w:p>
-    <w:p>
-      <w:pPr>
-        <w:pStyle w:val="FirstParagraph"/>
-      </w:pPr>
-      <w:r>
-        <w:t>Class: Note</w:t>
-      </w:r>
-    </w:p>
-    <w:p>
-      <w:pPr>
-        <w:numPr>
-          <w:ilvl w:val="0"/>
-          <w:numId w:val="17"/>
-        </w:numPr>
-      </w:pPr>
-      <w:r>
-        <w:t>spelling : String</w:t>
-      </w:r>
-    </w:p>
-    <w:p>
-      <w:pPr>
-        <w:numPr>
-          <w:ilvl w:val="0"/>
-          <w:numId w:val="17"/>
-        </w:numPr>
-      </w:pPr>
-      <w:r>
-        <w:t>pitchPosition : int</w:t>
-      </w:r>
-    </w:p>
-    <w:p>
-      <w:pPr>
-        <w:numPr>
-          <w:ilvl w:val="0"/>
-          <w:numId w:val="17"/>
-        </w:numPr>
-      </w:pPr>
-      <w:r>
-        <w:t>sharpName : String</w:t>
-      </w:r>
-    </w:p>
-    <w:p>
-      <w:pPr>
-        <w:numPr>
-          <w:ilvl w:val="0"/>
-          <w:numId w:val="17"/>
-        </w:numPr>
-      </w:pPr>
-      <w:r>
-        <w:t>flatName : String</w:t>
-      </w:r>
-    </w:p>
-    <w:p>
-      <w:pPr>
-        <w:numPr>
-          <w:ilvl w:val="0"/>
-          <w:numId w:val="17"/>
-        </w:numPr>
-      </w:pPr>
-      <w:r>
-        <w:t>otherNames : List</w:t>
-      </w:r>
-    </w:p>
-    <w:p>
-      <w:pPr>
-        <w:numPr>
-          <w:ilvl w:val="0"/>
-          <w:numId w:val="17"/>
-        </w:numPr>
-      </w:pPr>
-      <w:r>
-        <w:t>from(noteText : String) : Note</w:t>
-      </w:r>
-    </w:p>
-    <w:p>
-      <w:pPr>
-        <w:numPr>
-          <w:ilvl w:val="0"/>
-          <w:numId w:val="17"/>
-        </w:numPr>
-      </w:pPr>
-      <w:r>
-        <w:t>isValid(noteText : String) : boolean</w:t>
-      </w:r>
-    </w:p>
-    <w:p>
-      <w:pPr>
-        <w:numPr>
-          <w:ilvl w:val="0"/>
-          <w:numId w:val="17"/>
-        </w:numPr>
-      </w:pPr>
-      <w:r>
-        <w:lastRenderedPageBreak/>
-        <w:t>isValid() : boolean</w:t>
-      </w:r>
-    </w:p>
-    <w:p>
-      <w:pPr>
-        <w:numPr>
-          <w:ilvl w:val="0"/>
-          <w:numId w:val="17"/>
-        </w:numPr>
-      </w:pPr>
-      <w:r>
-        <w:t>distanceTo(otherNote : Note) : int</w:t>
-      </w:r>
-    </w:p>
-    <w:p>
-      <w:pPr>
-        <w:numPr>
-          <w:ilvl w:val="0"/>
-          <w:numId w:val="17"/>
-        </w:numPr>
-      </w:pPr>
-      <w:r>
-        <w:t>getSpelling() : String</w:t>
-      </w:r>
-    </w:p>
-    <w:p>
-      <w:pPr>
-        <w:numPr>
-          <w:ilvl w:val="0"/>
-          <w:numId w:val="17"/>
-        </w:numPr>
-      </w:pPr>
-      <w:r>
-        <w:t>getPitchPosition() : int</w:t>
-      </w:r>
-    </w:p>
-    <w:p>
-      <w:pPr>
-        <w:numPr>
-          <w:ilvl w:val="0"/>
-          <w:numId w:val="17"/>
-        </w:numPr>
-      </w:pPr>
-      <w:r>
-        <w:t>getSharpName() : String</w:t>
-      </w:r>
-    </w:p>
-    <w:p>
-      <w:pPr>
-        <w:numPr>
-          <w:ilvl w:val="0"/>
-          <w:numId w:val="17"/>
-        </w:numPr>
-      </w:pPr>
-      <w:r>
-        <w:t>getFlatName() : String</w:t>
-      </w:r>
-    </w:p>
-    <w:p>
-      <w:pPr>
-        <w:numPr>
-          <w:ilvl w:val="0"/>
-          <w:numId w:val="17"/>
+          <w:numId w:val="15"/>
         </w:numPr>
       </w:pPr>
       <w:r>
         <w:t>getOtherNames() : List</w:t>
-      </w:r>
-    </w:p>
-    <w:p>
-      <w:pPr>
-        <w:pStyle w:val="FirstParagraph"/>
-      </w:pPr>
-      <w:r>
-        <w:t>Class: Main</w:t>
-      </w:r>
-    </w:p>
-    <w:p>
-      <w:pPr>
-        <w:numPr>
-          <w:ilvl w:val="0"/>
-          <w:numId w:val="18"/>
-        </w:numPr>
-      </w:pPr>
-      <w:r>
-        <w:t>ADMIN_PASSWORD : String</w:t>
-      </w:r>
-    </w:p>
-    <w:p>
-      <w:pPr>
-        <w:numPr>
-          <w:ilvl w:val="0"/>
-          <w:numId w:val="18"/>
-        </w:numPr>
-      </w:pPr>
-      <w:r>
-        <w:t>main(args : String[]) : void</w:t>
-      </w:r>
-    </w:p>
-    <w:p>
-      <w:pPr>
-        <w:numPr>
-          <w:ilvl w:val="0"/>
-          <w:numId w:val="18"/>
-        </w:numPr>
-      </w:pPr>
-      <w:r>
-        <w:t>runChordFinderUser(scanner : Scanner, chordFinderSystem : ChordFinderSystem) : void</w:t>
-      </w:r>
-    </w:p>
-    <w:p>
-      <w:pPr>
-        <w:numPr>
-          <w:ilvl w:val="0"/>
-          <w:numId w:val="18"/>
-        </w:numPr>
-      </w:pPr>
-      <w:r>
-        <w:t>runAdministratorLogin(scanner : Scanner, chordFinderSystem : ChordFinderSystem) : void</w:t>
-      </w:r>
-    </w:p>
-    <w:p>
-      <w:pPr>
-        <w:numPr>
-          <w:ilvl w:val="0"/>
-          <w:numId w:val="18"/>
-        </w:numPr>
-      </w:pPr>
-      <w:r>
-        <w:t>runAdministratorMenu(scanner : Scanner, chordFinderSystem : ChordFinderSystem) : void</w:t>
-      </w:r>
-    </w:p>
-    <w:p>
-      <w:pPr>
-        <w:numPr>
-          <w:ilvl w:val="0"/>
-          <w:numId w:val="18"/>
-        </w:numPr>
-      </w:pPr>
-      <w:r>
-        <w:t>defineChordFormula(scanner : Scanner, chordFinderSystem : ChordFinderSystem) : void</w:t>
-      </w:r>
-    </w:p>
-    <w:p>
-      <w:pPr>
-        <w:numPr>
-          <w:ilvl w:val="0"/>
-          <w:numId w:val="18"/>
-        </w:numPr>
-      </w:pPr>
-      <w:r>
-        <w:t>editChordFormula(scanner : Scanner, chordFinderSystem : ChordFinderSystem) : void</w:t>
-      </w:r>
-    </w:p>
-    <w:p>
-      <w:pPr>
-        <w:numPr>
-          <w:ilvl w:val="0"/>
-          <w:numId w:val="18"/>
-        </w:numPr>
-      </w:pPr>
-      <w:r>
-        <w:t>deleteChordFormula(scanner : Scanner, chordFinderSystem : ChordFinderSystem) : void</w:t>
-      </w:r>
-    </w:p>
-    <w:p>
-      <w:pPr>
-        <w:numPr>
-          <w:ilvl w:val="0"/>
-          <w:numId w:val="18"/>
-        </w:numPr>
-      </w:pPr>
-      <w:r>
-        <w:t>viewChordFormulas(chordFinderSystem : ChordFinderSystem) : void</w:t>
-      </w:r>
-    </w:p>
-    <w:p>
-      <w:pPr>
-        <w:numPr>
-          <w:ilvl w:val="0"/>
-          <w:numId w:val="18"/>
-        </w:numPr>
-      </w:pPr>
-      <w:r>
-        <w:t>readChordFormula(scanner : Scanner) : ChordFormula</w:t>
       </w:r>
     </w:p>
     <w:p>
@@ -3110,7 +2855,6 @@
         <w:pStyle w:val="BodyText"/>
       </w:pPr>
       <w:r>
-        <w:lastRenderedPageBreak/>
         <w:t>If the person selects Chord Finder User, the system starts the Find Chord workflow. The user enters three notes separated by spaces. The system validates the input, checks the notes against the available formulas, and displays the matching chord names.</w:t>
       </w:r>
     </w:p>
@@ -3135,7 +2879,7 @@
         <w:pStyle w:val="Compact"/>
         <w:numPr>
           <w:ilvl w:val="0"/>
-          <w:numId w:val="19"/>
+          <w:numId w:val="17"/>
         </w:numPr>
       </w:pPr>
       <w:r>
@@ -3147,7 +2891,7 @@
         <w:pStyle w:val="Compact"/>
         <w:numPr>
           <w:ilvl w:val="0"/>
-          <w:numId w:val="19"/>
+          <w:numId w:val="17"/>
         </w:numPr>
       </w:pPr>
       <w:r>
@@ -3159,7 +2903,7 @@
         <w:pStyle w:val="Compact"/>
         <w:numPr>
           <w:ilvl w:val="0"/>
-          <w:numId w:val="19"/>
+          <w:numId w:val="17"/>
         </w:numPr>
       </w:pPr>
       <w:r>
@@ -3171,7 +2915,7 @@
         <w:pStyle w:val="Compact"/>
         <w:numPr>
           <w:ilvl w:val="0"/>
-          <w:numId w:val="19"/>
+          <w:numId w:val="17"/>
         </w:numPr>
       </w:pPr>
       <w:r>
@@ -3183,7 +2927,7 @@
         <w:pStyle w:val="Compact"/>
         <w:numPr>
           <w:ilvl w:val="0"/>
-          <w:numId w:val="19"/>
+          <w:numId w:val="17"/>
         </w:numPr>
       </w:pPr>
       <w:r>
@@ -3195,7 +2939,7 @@
         <w:pStyle w:val="Compact"/>
         <w:numPr>
           <w:ilvl w:val="0"/>
-          <w:numId w:val="19"/>
+          <w:numId w:val="17"/>
         </w:numPr>
       </w:pPr>
       <w:r>
@@ -3207,7 +2951,7 @@
         <w:pStyle w:val="Compact"/>
         <w:numPr>
           <w:ilvl w:val="0"/>
-          <w:numId w:val="19"/>
+          <w:numId w:val="17"/>
         </w:numPr>
       </w:pPr>
       <w:r>
@@ -3222,9 +2966,8 @@
         <w:rPr>
           <w:noProof/>
         </w:rPr>
-        <w:lastRenderedPageBreak/>
         <w:drawing>
-          <wp:inline distT="0" distB="0" distL="0" distR="0" wp14:anchorId="55D69334" wp14:editId="55D69335">
+          <wp:inline distT="0" distB="0" distL="0" distR="0" wp14:anchorId="5A65F5D0" wp14:editId="149422E1">
             <wp:extent cx="2021305" cy="1357162"/>
             <wp:effectExtent l="0" t="0" r="0" b="0"/>
             <wp:docPr id="59" name="Picture" descr="alt text"/>
@@ -3268,14 +3011,23 @@
     </w:p>
     <w:p>
       <w:pPr>
+        <w:pStyle w:val="ImageCaption"/>
+      </w:pPr>
+      <w:r>
+        <w:t>alt text</w:t>
+      </w:r>
+    </w:p>
+    <w:p>
+      <w:pPr>
         <w:pStyle w:val="CaptionedFigure"/>
       </w:pPr>
       <w:r>
         <w:rPr>
           <w:noProof/>
         </w:rPr>
+        <w:lastRenderedPageBreak/>
         <w:drawing>
-          <wp:inline distT="0" distB="0" distL="0" distR="0" wp14:anchorId="55D69336" wp14:editId="55D69337">
+          <wp:inline distT="0" distB="0" distL="0" distR="0" wp14:anchorId="120ABDF3" wp14:editId="4125CD32">
             <wp:extent cx="3465094" cy="1106905"/>
             <wp:effectExtent l="0" t="0" r="0" b="0"/>
             <wp:docPr id="62" name="Picture" descr="alt text"/>
@@ -3319,6 +3071,14 @@
     </w:p>
     <w:p>
       <w:pPr>
+        <w:pStyle w:val="ImageCaption"/>
+      </w:pPr>
+      <w:r>
+        <w:t>alt text</w:t>
+      </w:r>
+    </w:p>
+    <w:p>
+      <w:pPr>
         <w:pStyle w:val="CaptionedFigure"/>
       </w:pPr>
       <w:r>
@@ -3326,7 +3086,7 @@
           <w:noProof/>
         </w:rPr>
         <w:drawing>
-          <wp:inline distT="0" distB="0" distL="0" distR="0" wp14:anchorId="55D69338" wp14:editId="55D69339">
+          <wp:inline distT="0" distB="0" distL="0" distR="0" wp14:anchorId="623DE0A9" wp14:editId="7AE0AA01">
             <wp:extent cx="3542096" cy="1405288"/>
             <wp:effectExtent l="0" t="0" r="0" b="0"/>
             <wp:docPr id="65" name="Picture" descr="alt text"/>
@@ -3370,6 +3130,14 @@
     </w:p>
     <w:p>
       <w:pPr>
+        <w:pStyle w:val="ImageCaption"/>
+      </w:pPr>
+      <w:r>
+        <w:t>alt text</w:t>
+      </w:r>
+    </w:p>
+    <w:p>
+      <w:pPr>
         <w:pStyle w:val="CaptionedFigure"/>
       </w:pPr>
       <w:r>
@@ -3377,7 +3145,7 @@
           <w:noProof/>
         </w:rPr>
         <w:drawing>
-          <wp:inline distT="0" distB="0" distL="0" distR="0" wp14:anchorId="55D6933A" wp14:editId="55D6933B">
+          <wp:inline distT="0" distB="0" distL="0" distR="0" wp14:anchorId="17E6D6CF" wp14:editId="0DCB9327">
             <wp:extent cx="2002054" cy="1463040"/>
             <wp:effectExtent l="0" t="0" r="0" b="0"/>
             <wp:docPr id="68" name="Picture" descr="alt text"/>
@@ -3421,6 +3189,14 @@
     </w:p>
     <w:p>
       <w:pPr>
+        <w:pStyle w:val="ImageCaption"/>
+      </w:pPr>
+      <w:r>
+        <w:t>alt text</w:t>
+      </w:r>
+    </w:p>
+    <w:p>
+      <w:pPr>
         <w:pStyle w:val="CaptionedFigure"/>
       </w:pPr>
       <w:r>
@@ -3428,7 +3204,7 @@
           <w:noProof/>
         </w:rPr>
         <w:drawing>
-          <wp:inline distT="0" distB="0" distL="0" distR="0" wp14:anchorId="55D6933C" wp14:editId="55D6933D">
+          <wp:inline distT="0" distB="0" distL="0" distR="0" wp14:anchorId="55D8EB60" wp14:editId="7DCAA228">
             <wp:extent cx="1771048" cy="1020277"/>
             <wp:effectExtent l="0" t="0" r="0" b="0"/>
             <wp:docPr id="71" name="Picture" descr="alt text"/>
@@ -3472,15 +3248,22 @@
     </w:p>
     <w:p>
       <w:pPr>
+        <w:pStyle w:val="ImageCaption"/>
+      </w:pPr>
+      <w:r>
+        <w:t>alt text</w:t>
+      </w:r>
+    </w:p>
+    <w:p>
+      <w:pPr>
         <w:pStyle w:val="CaptionedFigure"/>
       </w:pPr>
       <w:r>
         <w:rPr>
           <w:noProof/>
         </w:rPr>
-        <w:lastRenderedPageBreak/>
         <w:drawing>
-          <wp:inline distT="0" distB="0" distL="0" distR="0" wp14:anchorId="55D6933E" wp14:editId="55D6933F">
+          <wp:inline distT="0" distB="0" distL="0" distR="0" wp14:anchorId="61BBC207" wp14:editId="7B0F7D27">
             <wp:extent cx="3003082" cy="1251284"/>
             <wp:effectExtent l="0" t="0" r="0" b="0"/>
             <wp:docPr id="74" name="Picture" descr="alt text"/>
@@ -3524,14 +3307,23 @@
     </w:p>
     <w:p>
       <w:pPr>
+        <w:pStyle w:val="ImageCaption"/>
+      </w:pPr>
+      <w:r>
+        <w:t>alt text</w:t>
+      </w:r>
+    </w:p>
+    <w:p>
+      <w:pPr>
         <w:pStyle w:val="CaptionedFigure"/>
       </w:pPr>
       <w:r>
         <w:rPr>
           <w:noProof/>
         </w:rPr>
+        <w:lastRenderedPageBreak/>
         <w:drawing>
-          <wp:inline distT="0" distB="0" distL="0" distR="0" wp14:anchorId="55D69340" wp14:editId="55D69341">
+          <wp:inline distT="0" distB="0" distL="0" distR="0" wp14:anchorId="1C412F9D" wp14:editId="0BCC69FD">
             <wp:extent cx="3647974" cy="1116530"/>
             <wp:effectExtent l="0" t="0" r="0" b="0"/>
             <wp:docPr id="77" name="Picture" descr="alt text"/>
@@ -3575,6 +3367,14 @@
     </w:p>
     <w:p>
       <w:pPr>
+        <w:pStyle w:val="ImageCaption"/>
+      </w:pPr>
+      <w:r>
+        <w:t>alt text</w:t>
+      </w:r>
+    </w:p>
+    <w:p>
+      <w:pPr>
         <w:pStyle w:val="CaptionedFigure"/>
       </w:pPr>
       <w:r>
@@ -3582,7 +3382,7 @@
           <w:noProof/>
         </w:rPr>
         <w:drawing>
-          <wp:inline distT="0" distB="0" distL="0" distR="0" wp14:anchorId="55D69342" wp14:editId="55D69343">
+          <wp:inline distT="0" distB="0" distL="0" distR="0" wp14:anchorId="3C0ABB1E" wp14:editId="02B94E2F">
             <wp:extent cx="3744227" cy="2974206"/>
             <wp:effectExtent l="0" t="0" r="0" b="0"/>
             <wp:docPr id="80" name="Picture" descr="alt text"/>
@@ -3626,12 +3426,1676 @@
     </w:p>
     <w:p>
       <w:pPr>
+        <w:rPr>
+          <w:rFonts w:eastAsiaTheme="majorEastAsia" w:cstheme="majorBidi"/>
+          <w:color w:val="0F4761" w:themeColor="accent1" w:themeShade="BF"/>
+          <w:sz w:val="28"/>
+          <w:szCs w:val="28"/>
+        </w:rPr>
+      </w:pPr>
+      <w:bookmarkStart w:id="15" w:name="bdd-scenarios"/>
+      <w:r>
+        <w:br w:type="page"/>
+      </w:r>
+    </w:p>
+    <w:p>
+      <w:pPr>
+        <w:pStyle w:val="Heading3"/>
+      </w:pPr>
+      <w:r>
+        <w:lastRenderedPageBreak/>
+        <w:t>BDD Scenarios</w:t>
+      </w:r>
+    </w:p>
+    <w:p>
+      <w:pPr>
+        <w:pStyle w:val="BodyText"/>
+      </w:pPr>
+      <w:r>
+        <w:t>Feature: Find Chord</w:t>
+      </w:r>
+    </w:p>
+    <w:p>
+      <w:pPr>
+        <w:pStyle w:val="BodyText"/>
+      </w:pPr>
+    </w:p>
+    <w:p>
+      <w:pPr>
+        <w:pStyle w:val="BodyText"/>
+      </w:pPr>
+      <w:r>
+        <w:t>Scenario: Identify G major from D G B</w:t>
+      </w:r>
+    </w:p>
+    <w:p>
+      <w:pPr>
+        <w:pStyle w:val="BodyText"/>
+      </w:pPr>
+      <w:r>
+        <w:t>  Given the Chord Finder system has a maintained major chord formula</w:t>
+      </w:r>
+    </w:p>
+    <w:p>
+      <w:pPr>
+        <w:pStyle w:val="BodyText"/>
+      </w:pPr>
+      <w:r>
+        <w:t>  When the user submits D G B</w:t>
+      </w:r>
+    </w:p>
+    <w:p>
+      <w:pPr>
+        <w:pStyle w:val="BodyText"/>
+      </w:pPr>
+      <w:r>
+        <w:t>  Then the system validates the submitted notes</w:t>
+      </w:r>
+    </w:p>
+    <w:p>
+      <w:pPr>
+        <w:pStyle w:val="BodyText"/>
+      </w:pPr>
+      <w:r>
+        <w:t>  And the system identifies G as a matching chord</w:t>
+      </w:r>
+    </w:p>
+    <w:p>
+      <w:pPr>
+        <w:pStyle w:val="BodyText"/>
+      </w:pPr>
+    </w:p>
+    <w:p>
+      <w:pPr>
+        <w:pStyle w:val="BodyText"/>
+      </w:pPr>
+      <w:r>
+        <w:t>Scenario: Identify C minor from C Eb G</w:t>
+      </w:r>
+    </w:p>
+    <w:p>
+      <w:pPr>
+        <w:pStyle w:val="BodyText"/>
+      </w:pPr>
+      <w:r>
+        <w:t>  Given the Chord Finder system has a maintained minor chord formula</w:t>
+      </w:r>
+    </w:p>
+    <w:p>
+      <w:pPr>
+        <w:pStyle w:val="BodyText"/>
+      </w:pPr>
+      <w:r>
+        <w:t>  When the user submits C Eb G</w:t>
+      </w:r>
+    </w:p>
+    <w:p>
+      <w:pPr>
+        <w:pStyle w:val="BodyText"/>
+      </w:pPr>
+      <w:r>
+        <w:t>  Then the system validates the submitted notes</w:t>
+      </w:r>
+    </w:p>
+    <w:p>
+      <w:pPr>
+        <w:pStyle w:val="BodyText"/>
+      </w:pPr>
+      <w:r>
+        <w:t>  And the system identifies Cm as a matching chord</w:t>
+      </w:r>
+    </w:p>
+    <w:p>
+      <w:pPr>
+        <w:pStyle w:val="BodyText"/>
+      </w:pPr>
+    </w:p>
+    <w:p>
+      <w:pPr>
+        <w:pStyle w:val="BodyText"/>
+      </w:pPr>
+      <w:r>
+        <w:t>Scenario: Identify C diminished from C Eb Gb</w:t>
+      </w:r>
+    </w:p>
+    <w:p>
+      <w:pPr>
+        <w:pStyle w:val="BodyText"/>
+      </w:pPr>
+      <w:r>
+        <w:t>  Given the Chord Finder system has a maintained diminished chord formula</w:t>
+      </w:r>
+    </w:p>
+    <w:p>
+      <w:pPr>
+        <w:pStyle w:val="BodyText"/>
+      </w:pPr>
+      <w:r>
+        <w:t>  When the user submits C Eb Gb</w:t>
+      </w:r>
+    </w:p>
+    <w:p>
+      <w:pPr>
+        <w:pStyle w:val="BodyText"/>
+      </w:pPr>
+      <w:r>
+        <w:t>  Then the system validates the submitted notes</w:t>
+      </w:r>
+    </w:p>
+    <w:p>
+      <w:pPr>
+        <w:pStyle w:val="BodyText"/>
+      </w:pPr>
+      <w:r>
+        <w:t xml:space="preserve">  And the system identifies </w:t>
+      </w:r>
+      <w:proofErr w:type="spellStart"/>
+      <w:r>
+        <w:t>Cdim</w:t>
+      </w:r>
+      <w:proofErr w:type="spellEnd"/>
+      <w:r>
+        <w:t xml:space="preserve"> as a matching chord</w:t>
+      </w:r>
+    </w:p>
+    <w:p>
+      <w:pPr>
+        <w:pStyle w:val="BodyText"/>
+      </w:pPr>
+    </w:p>
+    <w:p>
+      <w:pPr>
+        <w:pStyle w:val="BodyText"/>
+      </w:pPr>
+      <w:r>
+        <w:t>Scenario: Identify multiple augmented chords from B D# G</w:t>
+      </w:r>
+    </w:p>
+    <w:p>
+      <w:pPr>
+        <w:pStyle w:val="BodyText"/>
+      </w:pPr>
+      <w:r>
+        <w:t>  Given the Chord Finder system has a maintained augmented chord formula</w:t>
+      </w:r>
+    </w:p>
+    <w:p>
+      <w:pPr>
+        <w:pStyle w:val="BodyText"/>
+      </w:pPr>
+      <w:r>
+        <w:t>  When the user submits B D# G</w:t>
+      </w:r>
+    </w:p>
+    <w:p>
+      <w:pPr>
+        <w:pStyle w:val="BodyText"/>
+      </w:pPr>
+      <w:r>
+        <w:t>  Then the system validates the submitted notes</w:t>
+      </w:r>
+    </w:p>
+    <w:p>
+      <w:pPr>
+        <w:pStyle w:val="BodyText"/>
+      </w:pPr>
+      <w:r>
+        <w:t>  And the system identifies Baug as a matching chord</w:t>
+      </w:r>
+    </w:p>
+    <w:p>
+      <w:pPr>
+        <w:pStyle w:val="BodyText"/>
+      </w:pPr>
+      <w:r>
+        <w:t xml:space="preserve">  And the system identifies </w:t>
+      </w:r>
+      <w:proofErr w:type="spellStart"/>
+      <w:r>
+        <w:t>D#aug</w:t>
+      </w:r>
+      <w:proofErr w:type="spellEnd"/>
+      <w:r>
+        <w:t xml:space="preserve"> as a matching chord</w:t>
+      </w:r>
+    </w:p>
+    <w:p>
+      <w:pPr>
+        <w:pStyle w:val="BodyText"/>
+      </w:pPr>
+      <w:r>
+        <w:lastRenderedPageBreak/>
+        <w:t>  And the system identifies Gaug as a matching chord</w:t>
+      </w:r>
+    </w:p>
+    <w:p>
+      <w:pPr>
+        <w:pStyle w:val="BodyText"/>
+      </w:pPr>
+    </w:p>
+    <w:p>
+      <w:pPr>
+        <w:pStyle w:val="BodyText"/>
+      </w:pPr>
+      <w:r>
+        <w:t>Scenario: Identify chord regardless of note order</w:t>
+      </w:r>
+    </w:p>
+    <w:p>
+      <w:pPr>
+        <w:pStyle w:val="BodyText"/>
+      </w:pPr>
+      <w:r>
+        <w:t>  Given the Chord Finder system has a maintained major chord formula</w:t>
+      </w:r>
+    </w:p>
+    <w:p>
+      <w:pPr>
+        <w:pStyle w:val="BodyText"/>
+      </w:pPr>
+      <w:r>
+        <w:t>  When the user submits E G C</w:t>
+      </w:r>
+    </w:p>
+    <w:p>
+      <w:pPr>
+        <w:pStyle w:val="BodyText"/>
+      </w:pPr>
+      <w:r>
+        <w:t>  Then the system validates the submitted notes</w:t>
+      </w:r>
+    </w:p>
+    <w:p>
+      <w:pPr>
+        <w:pStyle w:val="BodyText"/>
+      </w:pPr>
+      <w:r>
+        <w:t>  And the system identifies C as a matching chord</w:t>
+      </w:r>
+    </w:p>
+    <w:p>
+      <w:pPr>
+        <w:pStyle w:val="BodyText"/>
+      </w:pPr>
+    </w:p>
+    <w:p>
+      <w:pPr>
+        <w:pStyle w:val="BodyText"/>
+      </w:pPr>
+      <w:r>
+        <w:t>Scenario: Identify chord using flat note spelling</w:t>
+      </w:r>
+    </w:p>
+    <w:p>
+      <w:pPr>
+        <w:pStyle w:val="BodyText"/>
+      </w:pPr>
+      <w:r>
+        <w:t>  Given the Chord Finder system has a maintained major chord formula</w:t>
+      </w:r>
+    </w:p>
+    <w:p>
+      <w:pPr>
+        <w:pStyle w:val="BodyText"/>
+      </w:pPr>
+      <w:r>
+        <w:t>  When the user submits Db F Ab</w:t>
+      </w:r>
+    </w:p>
+    <w:p>
+      <w:pPr>
+        <w:pStyle w:val="BodyText"/>
+      </w:pPr>
+      <w:r>
+        <w:t>  Then the system validates the submitted notes</w:t>
+      </w:r>
+    </w:p>
+    <w:p>
+      <w:pPr>
+        <w:pStyle w:val="BodyText"/>
+      </w:pPr>
+      <w:r>
+        <w:t>  And the system identifies Db as a matching chord</w:t>
+      </w:r>
+    </w:p>
+    <w:p>
+      <w:pPr>
+        <w:pStyle w:val="BodyText"/>
+      </w:pPr>
+    </w:p>
+    <w:p>
+      <w:pPr>
+        <w:pStyle w:val="BodyText"/>
+      </w:pPr>
+      <w:r>
+        <w:t>Scenario: Identify chord using sharp note spelling</w:t>
+      </w:r>
+    </w:p>
+    <w:p>
+      <w:pPr>
+        <w:pStyle w:val="BodyText"/>
+      </w:pPr>
+      <w:r>
+        <w:t>  Given the Chord Finder system has a maintained major chord formula</w:t>
+      </w:r>
+    </w:p>
+    <w:p>
+      <w:pPr>
+        <w:pStyle w:val="BodyText"/>
+      </w:pPr>
+      <w:r>
+        <w:t>  When the user submits C# F G#</w:t>
+      </w:r>
+    </w:p>
+    <w:p>
+      <w:pPr>
+        <w:pStyle w:val="BodyText"/>
+      </w:pPr>
+      <w:r>
+        <w:t>  Then the system validates the submitted notes</w:t>
+      </w:r>
+    </w:p>
+    <w:p>
+      <w:pPr>
+        <w:pStyle w:val="BodyText"/>
+      </w:pPr>
+      <w:r>
+        <w:t>  And the system identifies C# as a matching chord</w:t>
+      </w:r>
+    </w:p>
+    <w:p>
+      <w:pPr>
+        <w:pStyle w:val="BodyText"/>
+      </w:pPr>
+    </w:p>
+    <w:p>
+      <w:pPr>
+        <w:pStyle w:val="BodyText"/>
+      </w:pPr>
+      <w:r>
+        <w:t>Scenario: Identify chord when input has extra spaces</w:t>
+      </w:r>
+    </w:p>
+    <w:p>
+      <w:pPr>
+        <w:pStyle w:val="BodyText"/>
+      </w:pPr>
+      <w:r>
+        <w:t>  Given the Chord Finder system has a maintained major chord formula</w:t>
+      </w:r>
+    </w:p>
+    <w:p>
+      <w:pPr>
+        <w:pStyle w:val="BodyText"/>
+      </w:pPr>
+      <w:r>
+        <w:t>  When the user submits " C E G "</w:t>
+      </w:r>
+    </w:p>
+    <w:p>
+      <w:pPr>
+        <w:pStyle w:val="BodyText"/>
+      </w:pPr>
+      <w:r>
+        <w:t>  Then the system validates the submitted notes</w:t>
+      </w:r>
+    </w:p>
+    <w:p>
+      <w:pPr>
+        <w:pStyle w:val="BodyText"/>
+      </w:pPr>
+      <w:r>
+        <w:t>  And the system identifies C as a matching chord</w:t>
+      </w:r>
+    </w:p>
+    <w:p>
+      <w:pPr>
+        <w:pStyle w:val="BodyText"/>
+      </w:pPr>
+    </w:p>
+    <w:p>
+      <w:pPr>
+        <w:pStyle w:val="BodyText"/>
+      </w:pPr>
+    </w:p>
+    <w:p>
+      <w:pPr>
+        <w:pStyle w:val="BodyText"/>
+      </w:pPr>
+      <w:r>
+        <w:lastRenderedPageBreak/>
+        <w:t>Scenario: Identify chord when input uses lowercase notes</w:t>
+      </w:r>
+    </w:p>
+    <w:p>
+      <w:pPr>
+        <w:pStyle w:val="BodyText"/>
+      </w:pPr>
+      <w:r>
+        <w:t>  Given the Chord Finder system has a maintained major chord formula</w:t>
+      </w:r>
+    </w:p>
+    <w:p>
+      <w:pPr>
+        <w:pStyle w:val="BodyText"/>
+      </w:pPr>
+      <w:r>
+        <w:t>  When the user submits c e g</w:t>
+      </w:r>
+    </w:p>
+    <w:p>
+      <w:pPr>
+        <w:pStyle w:val="BodyText"/>
+      </w:pPr>
+      <w:r>
+        <w:t>  Then the system validates the submitted notes</w:t>
+      </w:r>
+    </w:p>
+    <w:p>
+      <w:pPr>
+        <w:pStyle w:val="BodyText"/>
+      </w:pPr>
+      <w:r>
+        <w:t>  And the system identifies C as a matching chord</w:t>
+      </w:r>
+    </w:p>
+    <w:p>
+      <w:pPr>
+        <w:pStyle w:val="BodyText"/>
+      </w:pPr>
+    </w:p>
+    <w:p>
+      <w:pPr>
+        <w:pStyle w:val="BodyText"/>
+      </w:pPr>
+      <w:r>
+        <w:t>Scenario: Reject fewer than three notes</w:t>
+      </w:r>
+    </w:p>
+    <w:p>
+      <w:pPr>
+        <w:pStyle w:val="BodyText"/>
+      </w:pPr>
+      <w:r>
+        <w:t>  Given the user is using the Chord Finder system</w:t>
+      </w:r>
+    </w:p>
+    <w:p>
+      <w:pPr>
+        <w:pStyle w:val="BodyText"/>
+      </w:pPr>
+      <w:r>
+        <w:t>  When the user submits C E</w:t>
+      </w:r>
+    </w:p>
+    <w:p>
+      <w:pPr>
+        <w:pStyle w:val="BodyText"/>
+      </w:pPr>
+      <w:r>
+        <w:t>  Then the system rejects the submitted notes</w:t>
+      </w:r>
+    </w:p>
+    <w:p>
+      <w:pPr>
+        <w:pStyle w:val="BodyText"/>
+      </w:pPr>
+      <w:r>
+        <w:t>  And the system displays an error message that exactly three notes are required</w:t>
+      </w:r>
+    </w:p>
+    <w:p>
+      <w:pPr>
+        <w:pStyle w:val="BodyText"/>
+      </w:pPr>
+    </w:p>
+    <w:p>
+      <w:pPr>
+        <w:pStyle w:val="BodyText"/>
+      </w:pPr>
+      <w:r>
+        <w:t>Scenario: Reject more than three notes</w:t>
+      </w:r>
+    </w:p>
+    <w:p>
+      <w:pPr>
+        <w:pStyle w:val="BodyText"/>
+      </w:pPr>
+      <w:r>
+        <w:t>  Given the user is using the Chord Finder system</w:t>
+      </w:r>
+    </w:p>
+    <w:p>
+      <w:pPr>
+        <w:pStyle w:val="BodyText"/>
+      </w:pPr>
+      <w:r>
+        <w:t>  When the user submits C E G B</w:t>
+      </w:r>
+    </w:p>
+    <w:p>
+      <w:pPr>
+        <w:pStyle w:val="BodyText"/>
+      </w:pPr>
+      <w:r>
+        <w:t>  Then the system rejects the submitted notes</w:t>
+      </w:r>
+    </w:p>
+    <w:p>
+      <w:pPr>
+        <w:pStyle w:val="BodyText"/>
+      </w:pPr>
+      <w:r>
+        <w:t>  And the system displays an error message that exactly three notes are required</w:t>
+      </w:r>
+    </w:p>
+    <w:p>
+      <w:pPr>
+        <w:pStyle w:val="BodyText"/>
+      </w:pPr>
+    </w:p>
+    <w:p>
+      <w:pPr>
+        <w:pStyle w:val="BodyText"/>
+      </w:pPr>
+      <w:r>
+        <w:t>Scenario: Reject invalid note spelling</w:t>
+      </w:r>
+    </w:p>
+    <w:p>
+      <w:pPr>
+        <w:pStyle w:val="BodyText"/>
+      </w:pPr>
+      <w:r>
+        <w:t>  Given the user is using the Chord Finder system</w:t>
+      </w:r>
+    </w:p>
+    <w:p>
+      <w:pPr>
+        <w:pStyle w:val="BodyText"/>
+      </w:pPr>
+      <w:r>
+        <w:t>  When the user submits C H G</w:t>
+      </w:r>
+    </w:p>
+    <w:p>
+      <w:pPr>
+        <w:pStyle w:val="BodyText"/>
+      </w:pPr>
+      <w:r>
+        <w:t>  Then the system rejects the submitted notes</w:t>
+      </w:r>
+    </w:p>
+    <w:p>
+      <w:pPr>
+        <w:pStyle w:val="BodyText"/>
+      </w:pPr>
+      <w:r>
+        <w:t>  And the system displays an invalid note message</w:t>
+      </w:r>
+    </w:p>
+    <w:p>
+      <w:pPr>
+        <w:pStyle w:val="BodyText"/>
+      </w:pPr>
+    </w:p>
+    <w:p>
+      <w:r>
+        <w:br w:type="page"/>
+      </w:r>
+    </w:p>
+    <w:p>
+      <w:pPr>
+        <w:pStyle w:val="BodyText"/>
+      </w:pPr>
+      <w:r>
+        <w:lastRenderedPageBreak/>
+        <w:t>Scenario: Reject unsupported accidental spelling</w:t>
+      </w:r>
+    </w:p>
+    <w:p>
+      <w:pPr>
+        <w:pStyle w:val="BodyText"/>
+      </w:pPr>
+      <w:r>
+        <w:t>  Given the user is using the Chord Finder system</w:t>
+      </w:r>
+    </w:p>
+    <w:p>
+      <w:pPr>
+        <w:pStyle w:val="BodyText"/>
+      </w:pPr>
+      <w:r>
+        <w:t>  When the user submits C## E G</w:t>
+      </w:r>
+    </w:p>
+    <w:p>
+      <w:pPr>
+        <w:pStyle w:val="BodyText"/>
+      </w:pPr>
+      <w:r>
+        <w:t>  Then the system rejects the submitted notes</w:t>
+      </w:r>
+    </w:p>
+    <w:p>
+      <w:pPr>
+        <w:pStyle w:val="BodyText"/>
+      </w:pPr>
+      <w:r>
+        <w:t>  And the system displays an invalid note message</w:t>
+      </w:r>
+    </w:p>
+    <w:p>
+      <w:pPr>
+        <w:pStyle w:val="BodyText"/>
+      </w:pPr>
+    </w:p>
+    <w:p>
+      <w:pPr>
+        <w:pStyle w:val="BodyText"/>
+      </w:pPr>
+      <w:r>
+        <w:t>Scenario: Reject blank note input</w:t>
+      </w:r>
+    </w:p>
+    <w:p>
+      <w:pPr>
+        <w:pStyle w:val="BodyText"/>
+      </w:pPr>
+      <w:r>
+        <w:t>  Given the user is using the Chord Finder system</w:t>
+      </w:r>
+    </w:p>
+    <w:p>
+      <w:pPr>
+        <w:pStyle w:val="BodyText"/>
+      </w:pPr>
+      <w:r>
+        <w:t>  When the user submits blank note input</w:t>
+      </w:r>
+    </w:p>
+    <w:p>
+      <w:pPr>
+        <w:pStyle w:val="BodyText"/>
+      </w:pPr>
+      <w:r>
+        <w:t>  Then the system rejects the submitted notes</w:t>
+      </w:r>
+    </w:p>
+    <w:p>
+      <w:pPr>
+        <w:pStyle w:val="BodyText"/>
+      </w:pPr>
+      <w:r>
+        <w:t>  And the system displays a message that notes are required</w:t>
+      </w:r>
+    </w:p>
+    <w:p>
+      <w:pPr>
+        <w:pStyle w:val="BodyText"/>
+      </w:pPr>
+    </w:p>
+    <w:p>
+      <w:pPr>
+        <w:pStyle w:val="BodyText"/>
+      </w:pPr>
+      <w:r>
+        <w:t>Scenario: Display no matching chord message</w:t>
+      </w:r>
+    </w:p>
+    <w:p>
+      <w:pPr>
+        <w:pStyle w:val="BodyText"/>
+      </w:pPr>
+      <w:r>
+        <w:t>  Given the Chord Finder system has maintained chord formulas</w:t>
+      </w:r>
+    </w:p>
+    <w:p>
+      <w:pPr>
+        <w:pStyle w:val="BodyText"/>
+      </w:pPr>
+      <w:r>
+        <w:t>  When the user submits C D E</w:t>
+      </w:r>
+    </w:p>
+    <w:p>
+      <w:pPr>
+        <w:pStyle w:val="BodyText"/>
+      </w:pPr>
+      <w:r>
+        <w:t>  Then the system validates the submitted notes</w:t>
+      </w:r>
+    </w:p>
+    <w:p>
+      <w:pPr>
+        <w:pStyle w:val="BodyText"/>
+      </w:pPr>
+      <w:r>
+        <w:t>  And the system displays a no matching chord message</w:t>
+      </w:r>
+    </w:p>
+    <w:p>
+      <w:pPr>
+        <w:pStyle w:val="BodyText"/>
+      </w:pPr>
+    </w:p>
+    <w:p>
+      <w:pPr>
+        <w:pStyle w:val="BodyText"/>
+      </w:pPr>
+      <w:r>
+        <w:t>Scenario: Display no match for duplicate submitted notes</w:t>
+      </w:r>
+    </w:p>
+    <w:p>
+      <w:pPr>
+        <w:pStyle w:val="BodyText"/>
+      </w:pPr>
+      <w:r>
+        <w:t>  Given the user is using the Chord Finder system</w:t>
+      </w:r>
+    </w:p>
+    <w:p>
+      <w:pPr>
+        <w:pStyle w:val="BodyText"/>
+      </w:pPr>
+      <w:r>
+        <w:t xml:space="preserve">  When the user submits C </w:t>
+      </w:r>
+      <w:proofErr w:type="spellStart"/>
+      <w:r>
+        <w:t>C</w:t>
+      </w:r>
+      <w:proofErr w:type="spellEnd"/>
+      <w:r>
+        <w:t xml:space="preserve"> E</w:t>
+      </w:r>
+    </w:p>
+    <w:p>
+      <w:pPr>
+        <w:pStyle w:val="BodyText"/>
+      </w:pPr>
+      <w:r>
+        <w:t>  Then the system rejects the submitted notes</w:t>
+      </w:r>
+    </w:p>
+    <w:p>
+      <w:pPr>
+        <w:pStyle w:val="BodyText"/>
+      </w:pPr>
+      <w:r>
+        <w:t>  And the system displays a message that three different notes are required</w:t>
+      </w:r>
+    </w:p>
+    <w:p>
+      <w:pPr>
+        <w:pStyle w:val="BodyText"/>
+      </w:pPr>
+    </w:p>
+    <w:p>
+      <w:pPr>
+        <w:pStyle w:val="BodyText"/>
+      </w:pPr>
+      <w:r>
+        <w:t>Scenario: Display no match when formula catalog is empty</w:t>
+      </w:r>
+    </w:p>
+    <w:p>
+      <w:pPr>
+        <w:pStyle w:val="BodyText"/>
+      </w:pPr>
+      <w:r>
+        <w:t>  Given the Chord Finder system has no maintained chord formulas</w:t>
+      </w:r>
+    </w:p>
+    <w:p>
+      <w:pPr>
+        <w:pStyle w:val="BodyText"/>
+      </w:pPr>
+      <w:r>
+        <w:t>  When the user submits C E G</w:t>
+      </w:r>
+    </w:p>
+    <w:p>
+      <w:pPr>
+        <w:pStyle w:val="BodyText"/>
+      </w:pPr>
+      <w:r>
+        <w:lastRenderedPageBreak/>
+        <w:t>  Then the system validates the submitted notes</w:t>
+      </w:r>
+    </w:p>
+    <w:p>
+      <w:pPr>
+        <w:pStyle w:val="BodyText"/>
+      </w:pPr>
+      <w:r>
+        <w:t>  And the system displays a no matching chord message</w:t>
+      </w:r>
+    </w:p>
+    <w:p>
+      <w:pPr>
+        <w:pStyle w:val="BodyText"/>
+      </w:pPr>
+    </w:p>
+    <w:p>
+      <w:pPr>
+        <w:pStyle w:val="BodyText"/>
+      </w:pPr>
+    </w:p>
+    <w:p>
+      <w:pPr>
+        <w:pStyle w:val="BodyText"/>
+      </w:pPr>
+      <w:r>
+        <w:t>Feature: Maintain Chord Formula</w:t>
+      </w:r>
+    </w:p>
+    <w:p>
+      <w:pPr>
+        <w:pStyle w:val="BodyText"/>
+      </w:pPr>
+    </w:p>
+    <w:p>
+      <w:pPr>
+        <w:pStyle w:val="BodyText"/>
+      </w:pPr>
+      <w:r>
+        <w:t>Scenario: Define a new chord formula</w:t>
+      </w:r>
+    </w:p>
+    <w:p>
+      <w:pPr>
+        <w:pStyle w:val="BodyText"/>
+      </w:pPr>
+      <w:r>
+        <w:t>  Given the administrator is using the Maintain Chord Formula menu</w:t>
+      </w:r>
+    </w:p>
+    <w:p>
+      <w:pPr>
+        <w:pStyle w:val="BodyText"/>
+      </w:pPr>
+      <w:r>
+        <w:t>  When the administrator defines a chord formula with valid formula information</w:t>
+      </w:r>
+    </w:p>
+    <w:p>
+      <w:pPr>
+        <w:pStyle w:val="BodyText"/>
+      </w:pPr>
+      <w:r>
+        <w:t>  Then the system stores the chord formula</w:t>
+      </w:r>
+    </w:p>
+    <w:p>
+      <w:pPr>
+        <w:pStyle w:val="BodyText"/>
+      </w:pPr>
+      <w:r>
+        <w:t>  And the system displays the updated formula catalog</w:t>
+      </w:r>
+    </w:p>
+    <w:p>
+      <w:pPr>
+        <w:pStyle w:val="BodyText"/>
+      </w:pPr>
+    </w:p>
+    <w:p>
+      <w:pPr>
+        <w:pStyle w:val="BodyText"/>
+      </w:pPr>
+      <w:r>
+        <w:t>Scenario: Edit an existing chord formula</w:t>
+      </w:r>
+    </w:p>
+    <w:p>
+      <w:pPr>
+        <w:pStyle w:val="BodyText"/>
+      </w:pPr>
+      <w:r>
+        <w:t>  Given the Chord Finder system has a maintained chord formula</w:t>
+      </w:r>
+    </w:p>
+    <w:p>
+      <w:pPr>
+        <w:pStyle w:val="BodyText"/>
+      </w:pPr>
+      <w:r>
+        <w:t>  And the administrator is using the Maintain Chord Formula menu</w:t>
+      </w:r>
+    </w:p>
+    <w:p>
+      <w:pPr>
+        <w:pStyle w:val="BodyText"/>
+      </w:pPr>
+      <w:r>
+        <w:t>  When the administrator edits the chord formula with valid formula information</w:t>
+      </w:r>
+    </w:p>
+    <w:p>
+      <w:pPr>
+        <w:pStyle w:val="BodyText"/>
+      </w:pPr>
+      <w:r>
+        <w:t>  Then the system updates the chord formula</w:t>
+      </w:r>
+    </w:p>
+    <w:p>
+      <w:pPr>
+        <w:pStyle w:val="BodyText"/>
+      </w:pPr>
+      <w:r>
+        <w:t>  And the system displays the updated formula catalog</w:t>
+      </w:r>
+    </w:p>
+    <w:p>
+      <w:pPr>
+        <w:pStyle w:val="BodyText"/>
+      </w:pPr>
+    </w:p>
+    <w:p>
+      <w:pPr>
+        <w:pStyle w:val="BodyText"/>
+      </w:pPr>
+      <w:r>
+        <w:t>Scenario: Delete an existing chord formula</w:t>
+      </w:r>
+    </w:p>
+    <w:p>
+      <w:pPr>
+        <w:pStyle w:val="BodyText"/>
+      </w:pPr>
+      <w:r>
+        <w:t>  Given the Chord Finder system has a maintained chord formula</w:t>
+      </w:r>
+    </w:p>
+    <w:p>
+      <w:pPr>
+        <w:pStyle w:val="BodyText"/>
+      </w:pPr>
+      <w:r>
+        <w:t>  And the administrator is using the Maintain Chord Formula menu</w:t>
+      </w:r>
+    </w:p>
+    <w:p>
+      <w:pPr>
+        <w:pStyle w:val="BodyText"/>
+      </w:pPr>
+      <w:r>
+        <w:t>  When the administrator deletes the chord formula</w:t>
+      </w:r>
+    </w:p>
+    <w:p>
+      <w:pPr>
+        <w:pStyle w:val="BodyText"/>
+      </w:pPr>
+      <w:r>
+        <w:t>  Then the system removes the chord formula</w:t>
+      </w:r>
+    </w:p>
+    <w:p>
+      <w:pPr>
+        <w:pStyle w:val="BodyText"/>
+      </w:pPr>
+      <w:r>
+        <w:t>  And the system displays the updated formula catalog</w:t>
+      </w:r>
+    </w:p>
+    <w:p>
+      <w:pPr>
+        <w:pStyle w:val="BodyText"/>
+      </w:pPr>
+    </w:p>
+    <w:p>
+      <w:r>
+        <w:br w:type="page"/>
+      </w:r>
+    </w:p>
+    <w:p>
+      <w:pPr>
+        <w:pStyle w:val="BodyText"/>
+      </w:pPr>
+      <w:r>
+        <w:lastRenderedPageBreak/>
+        <w:t>Scenario: View maintained chord formulas</w:t>
+      </w:r>
+    </w:p>
+    <w:p>
+      <w:pPr>
+        <w:pStyle w:val="BodyText"/>
+      </w:pPr>
+      <w:r>
+        <w:t>  Given the Chord Finder system has maintained chord formulas</w:t>
+      </w:r>
+    </w:p>
+    <w:p>
+      <w:pPr>
+        <w:pStyle w:val="BodyText"/>
+      </w:pPr>
+      <w:r>
+        <w:t>  And the administrator is using the Maintain Chord Formula menu</w:t>
+      </w:r>
+    </w:p>
+    <w:p>
+      <w:pPr>
+        <w:pStyle w:val="BodyText"/>
+      </w:pPr>
+      <w:r>
+        <w:t>  When the administrator views the chord formulas</w:t>
+      </w:r>
+    </w:p>
+    <w:p>
+      <w:pPr>
+        <w:pStyle w:val="BodyText"/>
+      </w:pPr>
+      <w:r>
+        <w:t>  Then the system displays the maintained chord formulas</w:t>
+      </w:r>
+    </w:p>
+    <w:p>
+      <w:pPr>
+        <w:pStyle w:val="BodyText"/>
+      </w:pPr>
+    </w:p>
+    <w:p>
+      <w:pPr>
+        <w:pStyle w:val="BodyText"/>
+      </w:pPr>
+      <w:r>
+        <w:t>Scenario: View empty chord formula catalog</w:t>
+      </w:r>
+    </w:p>
+    <w:p>
+      <w:pPr>
+        <w:pStyle w:val="BodyText"/>
+      </w:pPr>
+      <w:r>
+        <w:t>  Given the Chord Finder system has no maintained chord formulas</w:t>
+      </w:r>
+    </w:p>
+    <w:p>
+      <w:pPr>
+        <w:pStyle w:val="BodyText"/>
+      </w:pPr>
+      <w:r>
+        <w:t>  And the administrator is using the Maintain Chord Formula menu</w:t>
+      </w:r>
+    </w:p>
+    <w:p>
+      <w:pPr>
+        <w:pStyle w:val="BodyText"/>
+      </w:pPr>
+      <w:r>
+        <w:t>  When the administrator views the chord formulas</w:t>
+      </w:r>
+    </w:p>
+    <w:p>
+      <w:pPr>
+        <w:pStyle w:val="BodyText"/>
+      </w:pPr>
+      <w:r>
+        <w:t>  Then the system displays a message that no chord formulas are maintained</w:t>
+      </w:r>
+    </w:p>
+    <w:p>
+      <w:pPr>
+        <w:pStyle w:val="BodyText"/>
+      </w:pPr>
+    </w:p>
+    <w:p>
+      <w:pPr>
+        <w:pStyle w:val="BodyText"/>
+      </w:pPr>
+      <w:r>
+        <w:t>Scenario: Reject invalid formula information</w:t>
+      </w:r>
+    </w:p>
+    <w:p>
+      <w:pPr>
+        <w:pStyle w:val="BodyText"/>
+      </w:pPr>
+      <w:r>
+        <w:t>  Given the administrator is using the Maintain Chord Formula menu</w:t>
+      </w:r>
+    </w:p>
+    <w:p>
+      <w:pPr>
+        <w:pStyle w:val="BodyText"/>
+      </w:pPr>
+      <w:r>
+        <w:t>  When the administrator defines a chord formula with invalid formula information</w:t>
+      </w:r>
+    </w:p>
+    <w:p>
+      <w:pPr>
+        <w:pStyle w:val="BodyText"/>
+      </w:pPr>
+      <w:r>
+        <w:t>  Then the system rejects the chord formula</w:t>
+      </w:r>
+    </w:p>
+    <w:p>
+      <w:pPr>
+        <w:pStyle w:val="BodyText"/>
+      </w:pPr>
+      <w:r>
+        <w:t>  And the system displays an invalid formula message</w:t>
+      </w:r>
+    </w:p>
+    <w:p>
+      <w:pPr>
+        <w:pStyle w:val="BodyText"/>
+      </w:pPr>
+    </w:p>
+    <w:p>
+      <w:pPr>
+        <w:pStyle w:val="BodyText"/>
+      </w:pPr>
+      <w:r>
+        <w:t>Scenario: Reject duplicate formula name</w:t>
+      </w:r>
+    </w:p>
+    <w:p>
+      <w:pPr>
+        <w:pStyle w:val="BodyText"/>
+      </w:pPr>
+      <w:r>
+        <w:t>  Given the Chord Finder system already has a maintained major chord formula</w:t>
+      </w:r>
+    </w:p>
+    <w:p>
+      <w:pPr>
+        <w:pStyle w:val="BodyText"/>
+      </w:pPr>
+      <w:r>
+        <w:t>  And the administrator is using the Maintain Chord Formula menu</w:t>
+      </w:r>
+    </w:p>
+    <w:p>
+      <w:pPr>
+        <w:pStyle w:val="BodyText"/>
+      </w:pPr>
+      <w:r>
+        <w:t>  When the administrator defines another formula named major</w:t>
+      </w:r>
+    </w:p>
+    <w:p>
+      <w:pPr>
+        <w:pStyle w:val="BodyText"/>
+      </w:pPr>
+      <w:r>
+        <w:t>  Then the system rejects the chord formula</w:t>
+      </w:r>
+    </w:p>
+    <w:p>
+      <w:pPr>
+        <w:pStyle w:val="BodyText"/>
+      </w:pPr>
+      <w:r>
+        <w:t>  And the system displays a duplicate formula name message</w:t>
+      </w:r>
+    </w:p>
+    <w:p>
+      <w:pPr>
+        <w:pStyle w:val="BodyText"/>
+      </w:pPr>
+    </w:p>
+    <w:p>
+      <w:pPr>
+        <w:pStyle w:val="BodyText"/>
+      </w:pPr>
+      <w:r>
+        <w:t>Scenario: Reject duplicate formula pattern</w:t>
+      </w:r>
+    </w:p>
+    <w:p>
+      <w:pPr>
+        <w:pStyle w:val="BodyText"/>
+      </w:pPr>
+      <w:r>
+        <w:t>  Given the Chord Finder system already has a maintained major chord formula</w:t>
+      </w:r>
+    </w:p>
+    <w:p>
+      <w:pPr>
+        <w:pStyle w:val="BodyText"/>
+      </w:pPr>
+      <w:r>
+        <w:lastRenderedPageBreak/>
+        <w:t>  And the administrator is using the Maintain Chord Formula menu</w:t>
+      </w:r>
+    </w:p>
+    <w:p>
+      <w:pPr>
+        <w:pStyle w:val="BodyText"/>
+      </w:pPr>
+      <w:r>
+        <w:t>  When the administrator defines another formula with the same interval pattern as major</w:t>
+      </w:r>
+    </w:p>
+    <w:p>
+      <w:pPr>
+        <w:pStyle w:val="BodyText"/>
+      </w:pPr>
+      <w:r>
+        <w:t>  Then the system rejects the chord formula</w:t>
+      </w:r>
+    </w:p>
+    <w:p>
+      <w:pPr>
+        <w:pStyle w:val="BodyText"/>
+      </w:pPr>
+      <w:r>
+        <w:t>  And the system displays a duplicate formula pattern message</w:t>
+      </w:r>
+    </w:p>
+    <w:p>
+      <w:pPr>
+        <w:pStyle w:val="BodyText"/>
+      </w:pPr>
+    </w:p>
+    <w:p>
+      <w:pPr>
+        <w:pStyle w:val="BodyText"/>
+      </w:pPr>
+      <w:r>
+        <w:t>Scenario: Display formula not found when editing</w:t>
+      </w:r>
+    </w:p>
+    <w:p>
+      <w:pPr>
+        <w:pStyle w:val="BodyText"/>
+      </w:pPr>
+      <w:r>
+        <w:t>  Given the Chord Finder system does not have a formula named suspended</w:t>
+      </w:r>
+    </w:p>
+    <w:p>
+      <w:pPr>
+        <w:pStyle w:val="BodyText"/>
+      </w:pPr>
+      <w:r>
+        <w:t>  And the administrator is using the Maintain Chord Formula menu</w:t>
+      </w:r>
+    </w:p>
+    <w:p>
+      <w:pPr>
+        <w:pStyle w:val="BodyText"/>
+      </w:pPr>
+      <w:r>
+        <w:t>  When the administrator attempts to edit the suspended formula</w:t>
+      </w:r>
+    </w:p>
+    <w:p>
+      <w:pPr>
+        <w:pStyle w:val="BodyText"/>
+      </w:pPr>
+      <w:r>
+        <w:t>  Then the system displays a formula not found message</w:t>
+      </w:r>
+    </w:p>
+    <w:p>
+      <w:pPr>
+        <w:pStyle w:val="BodyText"/>
+      </w:pPr>
+    </w:p>
+    <w:p>
+      <w:pPr>
+        <w:pStyle w:val="BodyText"/>
+      </w:pPr>
+      <w:r>
+        <w:t>Scenario: Display formula not found when deleting</w:t>
+      </w:r>
+    </w:p>
+    <w:p>
+      <w:pPr>
+        <w:pStyle w:val="BodyText"/>
+      </w:pPr>
+      <w:r>
+        <w:t>  Given the Chord Finder system does not have a formula named suspended</w:t>
+      </w:r>
+    </w:p>
+    <w:p>
+      <w:pPr>
+        <w:pStyle w:val="BodyText"/>
+      </w:pPr>
+      <w:r>
+        <w:t>  And the administrator is using the Maintain Chord Formula menu</w:t>
+      </w:r>
+    </w:p>
+    <w:p>
+      <w:pPr>
+        <w:pStyle w:val="BodyText"/>
+      </w:pPr>
+      <w:r>
+        <w:t>  When the administrator attempts to delete the suspended formula</w:t>
+      </w:r>
+    </w:p>
+    <w:p>
+      <w:pPr>
+        <w:pStyle w:val="BodyText"/>
+      </w:pPr>
+      <w:r>
+        <w:t>  Then the system displays a formula not found message</w:t>
+      </w:r>
+    </w:p>
+    <w:p>
+      <w:pPr>
+        <w:pStyle w:val="BodyText"/>
+      </w:pPr>
+    </w:p>
+    <w:p>
+      <w:pPr>
+        <w:pStyle w:val="BodyText"/>
+      </w:pPr>
+      <w:r>
+        <w:t>Scenario: Use newly defined formula in future chord searches</w:t>
+      </w:r>
+    </w:p>
+    <w:p>
+      <w:pPr>
+        <w:pStyle w:val="BodyText"/>
+      </w:pPr>
+      <w:r>
+        <w:t>  Given the administrator defines a valid suspended chord formula</w:t>
+      </w:r>
+    </w:p>
+    <w:p>
+      <w:pPr>
+        <w:pStyle w:val="BodyText"/>
+      </w:pPr>
+      <w:r>
+        <w:t>  When the user submits C F G</w:t>
+      </w:r>
+    </w:p>
+    <w:p>
+      <w:pPr>
+        <w:pStyle w:val="BodyText"/>
+      </w:pPr>
+      <w:r>
+        <w:t>  Then the system validates the submitted notes</w:t>
+      </w:r>
+    </w:p>
+    <w:p>
+      <w:pPr>
+        <w:pStyle w:val="BodyText"/>
+      </w:pPr>
+      <w:r>
+        <w:t>  And the system identifies Csus4 as a matching chord</w:t>
+      </w:r>
+    </w:p>
+    <w:p>
+      <w:pPr>
+        <w:pStyle w:val="BodyText"/>
+      </w:pPr>
+    </w:p>
+    <w:p>
+      <w:pPr>
+        <w:pStyle w:val="BodyText"/>
+      </w:pPr>
+      <w:r>
+        <w:t>Scenario: Use edited formula in future chord searches</w:t>
+      </w:r>
+    </w:p>
+    <w:p>
+      <w:pPr>
+        <w:pStyle w:val="BodyText"/>
+      </w:pPr>
+      <w:r>
+        <w:t>  Given the Chord Finder system has a maintained chord formula</w:t>
+      </w:r>
+    </w:p>
+    <w:p>
+      <w:pPr>
+        <w:pStyle w:val="BodyText"/>
+      </w:pPr>
+      <w:r>
+        <w:t>  When the administrator edits the chord formula with valid formula information</w:t>
+      </w:r>
+    </w:p>
+    <w:p>
+      <w:pPr>
+        <w:pStyle w:val="BodyText"/>
+      </w:pPr>
+      <w:r>
+        <w:t>  And the user submits notes that match the edited formula</w:t>
+      </w:r>
+    </w:p>
+    <w:p>
+      <w:pPr>
+        <w:pStyle w:val="BodyText"/>
+      </w:pPr>
+      <w:r>
+        <w:lastRenderedPageBreak/>
+        <w:t>  Then the system identifies a chord using the edited formula</w:t>
+      </w:r>
+    </w:p>
+    <w:p>
+      <w:pPr>
+        <w:pStyle w:val="BodyText"/>
+      </w:pPr>
+    </w:p>
+    <w:p>
+      <w:pPr>
+        <w:pStyle w:val="BodyText"/>
+      </w:pPr>
+      <w:r>
+        <w:t>Scenario: Do not use deleted formula in future chord searches</w:t>
+      </w:r>
+    </w:p>
+    <w:p>
+      <w:pPr>
+        <w:pStyle w:val="BodyText"/>
+      </w:pPr>
+      <w:r>
+        <w:t>  Given the Chord Finder system has a maintained suspended chord formula</w:t>
+      </w:r>
+    </w:p>
+    <w:p>
+      <w:pPr>
+        <w:pStyle w:val="BodyText"/>
+      </w:pPr>
+      <w:r>
+        <w:t>  And the administrator deletes the suspended chord formula</w:t>
+      </w:r>
+    </w:p>
+    <w:p>
+      <w:pPr>
+        <w:pStyle w:val="BodyText"/>
+      </w:pPr>
+      <w:r>
+        <w:t>  When the user submits C F G</w:t>
+      </w:r>
+    </w:p>
+    <w:p>
+      <w:pPr>
+        <w:pStyle w:val="BodyText"/>
+      </w:pPr>
+      <w:r>
+        <w:t>  Then the system validates the submitted notes</w:t>
+      </w:r>
+    </w:p>
+    <w:p>
+      <w:pPr>
+        <w:pStyle w:val="BodyText"/>
+      </w:pPr>
+      <w:r>
+        <w:t>  And the system does not identify Csus4 as a matching chord</w:t>
+      </w:r>
+    </w:p>
+    <w:p>
+      <w:pPr>
+        <w:pStyle w:val="BodyText"/>
+      </w:pPr>
+    </w:p>
+    <w:p>
+      <w:pPr>
+        <w:pStyle w:val="BodyText"/>
+      </w:pPr>
+      <w:r>
+        <w:t>Scenario: Cancel formula definition</w:t>
+      </w:r>
+    </w:p>
+    <w:p>
+      <w:pPr>
+        <w:pStyle w:val="BodyText"/>
+      </w:pPr>
+      <w:r>
+        <w:t>  Given the administrator is defining a new chord formula</w:t>
+      </w:r>
+    </w:p>
+    <w:p>
+      <w:pPr>
+        <w:pStyle w:val="BodyText"/>
+      </w:pPr>
+      <w:r>
+        <w:t>  When the administrator cancels the formula definition</w:t>
+      </w:r>
+    </w:p>
+    <w:p>
+      <w:pPr>
+        <w:pStyle w:val="BodyText"/>
+      </w:pPr>
+      <w:r>
+        <w:t>  Then the system does not store the chord formula</w:t>
+      </w:r>
+    </w:p>
+    <w:p>
+      <w:pPr>
+        <w:pStyle w:val="BodyText"/>
+      </w:pPr>
+      <w:r>
+        <w:t>  And the system returns to the Maintain Chord Formula menu</w:t>
+      </w:r>
+    </w:p>
+    <w:p>
+      <w:pPr>
+        <w:pStyle w:val="BodyText"/>
+      </w:pPr>
+    </w:p>
+    <w:p>
+      <w:pPr>
+        <w:pStyle w:val="BodyText"/>
+      </w:pPr>
+      <w:r>
+        <w:t>Scenario: Cancel formula edit</w:t>
+      </w:r>
+    </w:p>
+    <w:p>
+      <w:pPr>
+        <w:pStyle w:val="BodyText"/>
+      </w:pPr>
+      <w:r>
+        <w:t>  Given the Chord Finder system has a maintained chord formula</w:t>
+      </w:r>
+    </w:p>
+    <w:p>
+      <w:pPr>
+        <w:pStyle w:val="BodyText"/>
+      </w:pPr>
+      <w:r>
+        <w:t>  And the administrator is editing the chord formula</w:t>
+      </w:r>
+    </w:p>
+    <w:p>
+      <w:pPr>
+        <w:pStyle w:val="BodyText"/>
+      </w:pPr>
+      <w:r>
+        <w:t>  When the administrator cancels the formula edit</w:t>
+      </w:r>
+    </w:p>
+    <w:p>
+      <w:pPr>
+        <w:pStyle w:val="BodyText"/>
+      </w:pPr>
+      <w:r>
+        <w:t>  Then the system does not change the chord formula</w:t>
+      </w:r>
+    </w:p>
+    <w:p>
+      <w:pPr>
+        <w:pStyle w:val="BodyText"/>
+      </w:pPr>
+      <w:r>
+        <w:t>  And the system returns to the Maintain Chord Formula menu</w:t>
+      </w:r>
+    </w:p>
+    <w:p>
+      <w:pPr>
+        <w:pStyle w:val="BodyText"/>
+      </w:pPr>
+    </w:p>
+    <w:p>
+      <w:pPr>
+        <w:pStyle w:val="BodyText"/>
+      </w:pPr>
+      <w:r>
+        <w:t>Scenario: Cancel formula deletion</w:t>
+      </w:r>
+    </w:p>
+    <w:p>
+      <w:pPr>
+        <w:pStyle w:val="BodyText"/>
+      </w:pPr>
+      <w:r>
+        <w:t>  Given the Chord Finder system has a maintained chord formula</w:t>
+      </w:r>
+    </w:p>
+    <w:p>
+      <w:pPr>
+        <w:pStyle w:val="BodyText"/>
+      </w:pPr>
+      <w:r>
+        <w:t>  And the administrator is deleting the chord formula</w:t>
+      </w:r>
+    </w:p>
+    <w:p>
+      <w:pPr>
+        <w:pStyle w:val="BodyText"/>
+      </w:pPr>
+      <w:r>
+        <w:t>  When the administrator cancels the formula deletion</w:t>
+      </w:r>
+    </w:p>
+    <w:p>
+      <w:pPr>
+        <w:pStyle w:val="BodyText"/>
+      </w:pPr>
+      <w:r>
+        <w:t>  Then the system does not remove the chord formula</w:t>
+      </w:r>
+    </w:p>
+    <w:p>
+      <w:pPr>
+        <w:pStyle w:val="BodyText"/>
+      </w:pPr>
+      <w:r>
+        <w:lastRenderedPageBreak/>
+        <w:t>  And the system returns to the Maintain Chord Formula menu</w:t>
+      </w:r>
+    </w:p>
+    <w:p>
+      <w:pPr>
+        <w:pStyle w:val="BodyText"/>
+      </w:pPr>
+    </w:p>
+    <w:p>
+      <w:pPr>
+        <w:pStyle w:val="BodyText"/>
+      </w:pPr>
+    </w:p>
+    <w:p>
+      <w:pPr>
         <w:pStyle w:val="Heading2"/>
       </w:pPr>
-      <w:bookmarkStart w:id="15" w:name="bdd-traceability-to-use-cases"/>
+      <w:bookmarkStart w:id="16" w:name="tdd-traceability-to-methods"/>
       <w:bookmarkEnd w:id="14"/>
-      <w:r>
-        <w:t>BDD Traceability to Use Cases</w:t>
+      <w:bookmarkEnd w:id="15"/>
+      <w:r>
+        <w:t>TDD Traceability to Methods</w:t>
       </w:r>
     </w:p>
     <w:p>
@@ -3639,772 +5103,225 @@
         <w:pStyle w:val="FirstParagraph"/>
       </w:pPr>
       <w:r>
-        <w:t>The BDD tests trace directly back to the main Chord Finder use cases. Each scenario confirms that the system behavior described in the use cases is supported by the design and implementation.</w:t>
-      </w:r>
-    </w:p>
-    <w:p>
-      <w:pPr>
-        <w:pStyle w:val="BodyText"/>
-      </w:pPr>
-      <w:r>
-        <w:t>The Find Chord use case is covered by scenarios where a user submits three valid notes and the system identifies the correct chord. For example, when the user submits C E G, the system identifies C major. When the user submits C Eb G, the system identifies C minor. These scenarios confirm that the system can validate submitted notes, compare them against maintained chord formulas, and return matching chord names.</w:t>
-      </w:r>
-    </w:p>
-    <w:p>
-      <w:pPr>
-        <w:pStyle w:val="BodyText"/>
-      </w:pPr>
-      <w:r>
-        <w:t xml:space="preserve">The Find Chord use case is also covered by alternate scenarios. If the user submits invalid note input, fewer than three notes, or more than three notes, the system rejects the input </w:t>
-      </w:r>
+        <w:t>TDD was used to test the individual methods and classes that implement the system behavior. The unit tests verify note validation, pitch position mapping, interval calculation, formula matching, chord identification, no-match handling, and administrator formula maintenance.</w:t>
+      </w:r>
+    </w:p>
+    <w:p>
+      <w:pPr>
+        <w:pStyle w:val="Heading2"/>
+      </w:pPr>
+      <w:bookmarkStart w:id="17" w:name="class-method-tdd-test"/>
+      <w:bookmarkEnd w:id="16"/>
+      <w:r>
+        <w:t>Class / Method TDD Test</w:t>
+      </w:r>
+    </w:p>
+    <w:p>
+      <w:pPr>
+        <w:pStyle w:val="FirstParagraph"/>
+      </w:pPr>
+      <w:r>
+        <w:t>ChordFinderSystem.identifyChord() shouldIdentifyMajorChord</w:t>
+      </w:r>
+    </w:p>
+    <w:p>
+      <w:pPr>
+        <w:pStyle w:val="BodyText"/>
+      </w:pPr>
+      <w:r>
+        <w:t>ChordFinderSystem.identifyChord() shouldIdentifyMinorChord</w:t>
+      </w:r>
+    </w:p>
+    <w:p>
+      <w:pPr>
+        <w:pStyle w:val="BodyText"/>
+      </w:pPr>
+      <w:r>
+        <w:t>ChordFinderSystem.identifyChord() shouldReturnEmptyListForNoMatchingChord</w:t>
+      </w:r>
+    </w:p>
+    <w:p>
+      <w:pPr>
+        <w:pStyle w:val="BodyText"/>
+      </w:pPr>
+      <w:r>
+        <w:t>ChordFinderSystem.identifyChord() shouldUseNewFormulaAfterAdministratorDefinesFormula</w:t>
+      </w:r>
+    </w:p>
+    <w:p>
+      <w:pPr>
+        <w:pStyle w:val="BodyText"/>
+      </w:pPr>
+      <w:r>
+        <w:t>ChordFinderSystem.identifyChord() shouldNotUseFormulaAfterAdministratorDeletesFormula</w:t>
+      </w:r>
+    </w:p>
+    <w:p>
+      <w:pPr>
+        <w:pStyle w:val="BodyText"/>
+      </w:pPr>
+      <w:r>
+        <w:t>ChordFinderSystem.validateNotes() shouldRejectFewerThanThreeNotes</w:t>
+      </w:r>
+    </w:p>
+    <w:p>
+      <w:pPr>
+        <w:pStyle w:val="BodyText"/>
+      </w:pPr>
+      <w:r>
+        <w:t>ChordFinderSystem.validateNotes() shouldRejectMoreThanThreeNotes</w:t>
+      </w:r>
+    </w:p>
+    <w:p>
+      <w:pPr>
+        <w:pStyle w:val="BodyText"/>
+      </w:pPr>
+      <w:r>
+        <w:t>ChordFinderSystem.validateNotes() shouldRejectInvalidNoteSpelling</w:t>
+      </w:r>
+    </w:p>
+    <w:p>
+      <w:pPr>
+        <w:pStyle w:val="BodyText"/>
+      </w:pPr>
+      <w:r>
+        <w:t>ChordFinderSystem.defineChordFormula() shouldUseNewFormulaAfterAdministratorDefinesFormula</w:t>
+      </w:r>
+    </w:p>
+    <w:p>
+      <w:pPr>
+        <w:pStyle w:val="BodyText"/>
+      </w:pPr>
+      <w:r>
+        <w:t>ChordFinderSystem.deleteChordFormula() shouldNotUseFormulaAfterAdministratorDeletesFormula</w:t>
+      </w:r>
+    </w:p>
+    <w:p>
+      <w:pPr>
+        <w:pStyle w:val="BodyText"/>
+      </w:pPr>
+      <w:r>
+        <w:t>ChordFormulaCatalog.getChordFormulas() shouldStartWithDefaultFormulas</w:t>
+      </w:r>
+    </w:p>
+    <w:p>
+      <w:pPr>
+        <w:pStyle w:val="BodyText"/>
+      </w:pPr>
+      <w:r>
+        <w:t>ChordFormulaCatalog.defineChordFormula() shouldDefineNewFormula</w:t>
+      </w:r>
+    </w:p>
+    <w:p>
+      <w:pPr>
+        <w:pStyle w:val="BodyText"/>
+      </w:pPr>
+      <w:r>
+        <w:t>ChordFormulaCatalog.editChordFormula() shouldEditExistingFormula</w:t>
+      </w:r>
+    </w:p>
+    <w:p>
+      <w:pPr>
+        <w:pStyle w:val="BodyText"/>
+      </w:pPr>
+      <w:r>
+        <w:t>ChordFormulaCatalog.deleteChordFormula() shouldDeleteExistingFormula</w:t>
+      </w:r>
+    </w:p>
+    <w:p>
+      <w:pPr>
+        <w:pStyle w:val="BodyText"/>
+      </w:pPr>
+      <w:r>
+        <w:t>ChordFormulaCatalog.findFormula() shouldEditExistingFormula</w:t>
+      </w:r>
+    </w:p>
+    <w:p>
+      <w:pPr>
+        <w:pStyle w:val="BodyText"/>
+      </w:pPr>
+      <w:r>
+        <w:t>ChordFormula.matchesNotes() majorFormulaShouldMatchMajorTriad</w:t>
+      </w:r>
+    </w:p>
+    <w:p>
+      <w:pPr>
+        <w:pStyle w:val="BodyText"/>
+      </w:pPr>
+      <w:r>
+        <w:t>ChordFormula.matchesNotes() minorFormulaShouldMatchMinorTriad</w:t>
+      </w:r>
+    </w:p>
+    <w:p>
+      <w:pPr>
+        <w:pStyle w:val="BodyText"/>
+      </w:pPr>
       <w:r>
         <w:lastRenderedPageBreak/>
-        <w:t>and does not identify a chord. If the user submits three valid notes that do not match any maintained chord formula, the system returns no matching chord result. These scenarios trace to the validation and no-match alternate paths in the use case.</w:t>
-      </w:r>
-    </w:p>
-    <w:p>
-      <w:pPr>
-        <w:pStyle w:val="BodyText"/>
-      </w:pPr>
-      <w:r>
-        <w:t>The Maintain Chord Formula use case is covered by administrator scenarios for adding, editing, deleting, and viewing chord formulas. The define formula scenario confirms that a new ChordFormula can be added to the ChordFormulaCatalog and then used by the system during chord identification. The edit formula scenario confirms that an existing formula can be revised. The delete formula scenario confirms that a removed formula is no longer used to identify chords. The view formula scenario confirms that the system can return the maintained list of chord formulas.</w:t>
-      </w:r>
-    </w:p>
-    <w:p>
-      <w:pPr>
-        <w:pStyle w:val="BodyText"/>
-      </w:pPr>
-      <w:r>
-        <w:t>The BDD scenarios also verify the connection between the two use cases. Formula maintenance affects chord identification because the ChordFinderSystem uses the ChordFormulaCatalog when matching submitted notes. This means that adding, editing, or deleting a formula changes what chords the system can identify.</w:t>
-      </w:r>
-    </w:p>
-    <w:p>
-      <w:pPr>
-        <w:pStyle w:val="BodyText"/>
-      </w:pPr>
-      <w:r>
-        <w:t>Overall, the BDD tests provide traceability from the use case requirements to the system behavior. They show that the system supports the main paths and alternate paths for both finding chords and maintaining chord formulas.</w:t>
+        <w:t>ChordFormula.matchesNotes() majorFormulaShouldNotMatchMinorTriad</w:t>
+      </w:r>
+    </w:p>
+    <w:p>
+      <w:pPr>
+        <w:pStyle w:val="BodyText"/>
+      </w:pPr>
+      <w:r>
+        <w:t>ChordFormula.updateFormula() updateFormulaShouldReviseFormulaValues</w:t>
+      </w:r>
+    </w:p>
+    <w:p>
+      <w:pPr>
+        <w:pStyle w:val="BodyText"/>
+      </w:pPr>
+      <w:r>
+        <w:t>Note.from() shouldCreateValidNaturalNote</w:t>
+      </w:r>
+    </w:p>
+    <w:p>
+      <w:pPr>
+        <w:pStyle w:val="BodyText"/>
+      </w:pPr>
+      <w:r>
+        <w:t>Note.from() shouldCreateValidSharpNote</w:t>
+      </w:r>
+    </w:p>
+    <w:p>
+      <w:pPr>
+        <w:pStyle w:val="BodyText"/>
+      </w:pPr>
+      <w:r>
+        <w:t>Note.from() shouldCreateValidFlatNote</w:t>
+      </w:r>
+    </w:p>
+    <w:p>
+      <w:pPr>
+        <w:pStyle w:val="BodyText"/>
+      </w:pPr>
+      <w:r>
+        <w:t>Note.isValid() shouldRejectInvalidNoteText</w:t>
+      </w:r>
+    </w:p>
+    <w:p>
+      <w:pPr>
+        <w:pStyle w:val="BodyText"/>
+      </w:pPr>
+      <w:r>
+        <w:t>Note.distanceTo() shouldCalculateDistanceForward</w:t>
+      </w:r>
+    </w:p>
+    <w:p>
+      <w:pPr>
+        <w:pStyle w:val="BodyText"/>
+      </w:pPr>
+      <w:r>
+        <w:t>Note.distanceTo() shouldCalculateDistanceAcrossOctave</w:t>
       </w:r>
     </w:p>
     <w:p>
       <w:pPr>
         <w:pStyle w:val="Heading3"/>
       </w:pPr>
-      <w:bookmarkStart w:id="16" w:name="find-chord-bdd-traceability"/>
-      <w:r>
-        <w:t>Find Chord BDD Traceability</w:t>
-      </w:r>
-    </w:p>
-    <w:p>
-      <w:pPr>
-        <w:pStyle w:val="Heading2"/>
-      </w:pPr>
-      <w:bookmarkStart w:id="17" w:name="behavior-bdd-scenario"/>
-      <w:bookmarkEnd w:id="15"/>
-      <w:bookmarkEnd w:id="16"/>
-      <w:r>
-        <w:t>Behavior BDD Scenario</w:t>
-      </w:r>
-    </w:p>
-    <w:p>
-      <w:pPr>
-        <w:pStyle w:val="FirstParagraph"/>
-      </w:pPr>
-      <w:r>
-        <w:t>User submits valid major triad Identify G major from D G B</w:t>
-      </w:r>
-    </w:p>
-    <w:p>
-      <w:pPr>
-        <w:pStyle w:val="BodyText"/>
-      </w:pPr>
-      <w:r>
-        <w:t>User submits valid minor triad Identify C minor from C Eb G</w:t>
-      </w:r>
-    </w:p>
-    <w:p>
-      <w:pPr>
-        <w:pStyle w:val="BodyText"/>
-      </w:pPr>
-      <w:r>
-        <w:t>User submits augmented triad Identify multiple augmented chords from B D# G</w:t>
-      </w:r>
-    </w:p>
-    <w:p>
-      <w:pPr>
-        <w:pStyle w:val="BodyText"/>
-      </w:pPr>
-      <w:r>
-        <w:t>User submits fewer than three notes Reject fewer than three notes</w:t>
-      </w:r>
-    </w:p>
-    <w:p>
-      <w:pPr>
-        <w:pStyle w:val="BodyText"/>
-      </w:pPr>
-      <w:r>
-        <w:t>User submits more than three notes Reject more than three notes</w:t>
-      </w:r>
-    </w:p>
-    <w:p>
-      <w:pPr>
-        <w:pStyle w:val="BodyText"/>
-      </w:pPr>
-      <w:r>
-        <w:t>User submits invalid note spelling Reject invalid note spelling</w:t>
-      </w:r>
-    </w:p>
-    <w:p>
-      <w:pPr>
-        <w:pStyle w:val="BodyText"/>
-      </w:pPr>
-      <w:r>
-        <w:t>User submits valid notes with no match Display no matching chord message</w:t>
-      </w:r>
-    </w:p>
-    <w:p>
-      <w:pPr>
-        <w:pStyle w:val="Heading3"/>
-      </w:pPr>
-      <w:bookmarkStart w:id="18" w:name="maintain-chord-formula-bdd-traceability"/>
-      <w:r>
-        <w:t>Maintain Chord Formula BDD Traceability</w:t>
-      </w:r>
-    </w:p>
-    <w:p>
-      <w:pPr>
-        <w:pStyle w:val="Heading2"/>
-      </w:pPr>
-      <w:bookmarkStart w:id="19" w:name="behavior-bdd-scenario-1"/>
-      <w:bookmarkEnd w:id="17"/>
-      <w:bookmarkEnd w:id="18"/>
-      <w:r>
-        <w:t>Behavior BDD Scenario</w:t>
-      </w:r>
-    </w:p>
-    <w:p>
-      <w:pPr>
-        <w:pStyle w:val="FirstParagraph"/>
-      </w:pPr>
-      <w:r>
-        <w:t>Administrator defines new chord formula Add suspended fourth formula</w:t>
-      </w:r>
-    </w:p>
-    <w:p>
-      <w:pPr>
-        <w:pStyle w:val="BodyText"/>
-      </w:pPr>
-      <w:r>
-        <w:t>Administrator edits existing chord formula Edit existing chord formula values</w:t>
-      </w:r>
-    </w:p>
-    <w:p>
-      <w:pPr>
-        <w:pStyle w:val="BodyText"/>
-      </w:pPr>
-      <w:r>
-        <w:t>Administrator deletes chord formula Delete minor chord formula</w:t>
-      </w:r>
-    </w:p>
-    <w:p>
-      <w:pPr>
-        <w:pStyle w:val="BodyText"/>
-      </w:pPr>
-      <w:r>
-        <w:t>Administrator views chord formulas View maintained chord formula list</w:t>
-      </w:r>
-    </w:p>
-    <w:p>
-      <w:pPr>
-        <w:pStyle w:val="BodyText"/>
-      </w:pPr>
-      <w:r>
-        <w:lastRenderedPageBreak/>
-        <w:t>Administrator adds formula used by search Identify chord using newly added formula</w:t>
-      </w:r>
-    </w:p>
-    <w:p>
-      <w:pPr>
-        <w:pStyle w:val="BodyText"/>
-      </w:pPr>
-      <w:r>
-        <w:t>Administrator deletes formula used by search Removed formula is no longer used</w:t>
-      </w:r>
-    </w:p>
-    <w:p>
-      <w:pPr>
-        <w:pStyle w:val="BodyText"/>
-      </w:pPr>
-      <w:r>
-        <w:t>Administrator edits formula used by search Updated formula changes chord matching</w:t>
-      </w:r>
-    </w:p>
-    <w:p>
-      <w:pPr>
-        <w:pStyle w:val="BodyText"/>
-      </w:pPr>
-      <w:r>
-        <w:t>Administrator enters unknown formula name Display formula not found message</w:t>
-      </w:r>
-    </w:p>
-    <w:p>
-      <w:pPr>
-        <w:pStyle w:val="Heading3"/>
-      </w:pPr>
-      <w:bookmarkStart w:id="20" w:name="bdd-scenarios"/>
-      <w:r>
-        <w:t>BDD Scenarios</w:t>
-      </w:r>
-    </w:p>
-    <w:p>
-      <w:pPr>
-        <w:pStyle w:val="FirstParagraph"/>
-      </w:pPr>
-      <w:r>
-        <w:t>Feature: Find Chord</w:t>
-      </w:r>
-    </w:p>
-    <w:p>
-      <w:pPr>
-        <w:pStyle w:val="BodyText"/>
-      </w:pPr>
-      <w:r>
-        <w:t>Scenario: Identify G major from D G B</w:t>
-      </w:r>
-    </w:p>
-    <w:p>
-      <w:pPr>
-        <w:pStyle w:val="BodyText"/>
-      </w:pPr>
-      <w:r>
-        <w:t>Given the Chord Finder system has a maintained major chord formula When the user submits D G B Then the system validates the submitted notes And the system identifies G as a matching chord</w:t>
-      </w:r>
-    </w:p>
-    <w:p>
-      <w:pPr>
-        <w:pStyle w:val="BodyText"/>
-      </w:pPr>
-      <w:r>
-        <w:t>Scenario: Identify C minor from C Eb G</w:t>
-      </w:r>
-    </w:p>
-    <w:p>
-      <w:pPr>
-        <w:pStyle w:val="BodyText"/>
-      </w:pPr>
-      <w:r>
-        <w:t>Given the Chord Finder system has a maintained minor chord formula When the user submits C Eb G Then the system validates the submitted notes And the system identifies Cm as a matching chord</w:t>
-      </w:r>
-    </w:p>
-    <w:p>
-      <w:pPr>
-        <w:pStyle w:val="BodyText"/>
-      </w:pPr>
-      <w:r>
-        <w:t>Scenario: Identify multiple augmented chords from B D# G</w:t>
-      </w:r>
-    </w:p>
-    <w:p>
-      <w:pPr>
-        <w:pStyle w:val="BodyText"/>
-      </w:pPr>
-      <w:r>
-        <w:t>Given the Chord Finder system has a maintained augmented chord formula When the user submits B D# G Then the system validates the submitted notes And the system identifies Baug as a matching chord And the system identifies D#aug as a matching chord And the system identifies Gaug as a matching chord</w:t>
-      </w:r>
-    </w:p>
-    <w:p>
-      <w:pPr>
-        <w:pStyle w:val="BodyText"/>
-      </w:pPr>
-      <w:r>
-        <w:t>Scenario: Reject fewer than three notes</w:t>
-      </w:r>
-    </w:p>
-    <w:p>
-      <w:pPr>
-        <w:pStyle w:val="BodyText"/>
-      </w:pPr>
-      <w:r>
-        <w:t>Given the user is using the Chord Finder system When the user submits C E Then the system rejects the submitted notes And the system displays an invalid note entry message</w:t>
-      </w:r>
-    </w:p>
-    <w:p>
-      <w:pPr>
-        <w:pStyle w:val="BodyText"/>
-      </w:pPr>
-      <w:r>
-        <w:t>Scenario: Reject more than three notes</w:t>
-      </w:r>
-    </w:p>
-    <w:p>
-      <w:pPr>
-        <w:pStyle w:val="BodyText"/>
-      </w:pPr>
-      <w:r>
-        <w:t>Given the user is using the Chord Finder system When the user submits C E G B Then the system rejects the submitted notes And the system displays an invalid note entry message</w:t>
-      </w:r>
-    </w:p>
-    <w:p>
-      <w:pPr>
-        <w:pStyle w:val="BodyText"/>
-      </w:pPr>
-      <w:r>
-        <w:t>Scenario: Reject invalid note spelling</w:t>
-      </w:r>
-    </w:p>
-    <w:p>
-      <w:pPr>
-        <w:pStyle w:val="BodyText"/>
-      </w:pPr>
-      <w:r>
-        <w:t>Given the user is using the Chord Finder system When the user submits C H G Then the system rejects the submitted notes And the system displays an invalid note entry message</w:t>
-      </w:r>
-    </w:p>
-    <w:p>
-      <w:pPr>
-        <w:pStyle w:val="BodyText"/>
-      </w:pPr>
-      <w:r>
-        <w:t>Scenario: Reject blank note input</w:t>
-      </w:r>
-    </w:p>
-    <w:p>
-      <w:pPr>
-        <w:pStyle w:val="BodyText"/>
-      </w:pPr>
-      <w:r>
-        <w:t>Given the user is using the Chord Finder system When the user submits blank note input Then the system rejects the submitted notes And the system displays an invalid note entry message</w:t>
-      </w:r>
-    </w:p>
-    <w:p>
-      <w:pPr>
-        <w:pStyle w:val="BodyText"/>
-      </w:pPr>
-      <w:r>
-        <w:lastRenderedPageBreak/>
-        <w:t>Scenario: Display no matching chord message</w:t>
-      </w:r>
-    </w:p>
-    <w:p>
-      <w:pPr>
-        <w:pStyle w:val="BodyText"/>
-      </w:pPr>
-      <w:r>
-        <w:t>Given the Chord Finder system has maintained chord formulas When the user submits C D G Then the system validates the submitted notes And the system does not identify a matching chord And the system displays a no matching chord message</w:t>
-      </w:r>
-    </w:p>
-    <w:p>
-      <w:pPr>
-        <w:pStyle w:val="BodyText"/>
-      </w:pPr>
-      <w:r>
-        <w:t>Scenario: Display no matching chord for duplicate notes</w:t>
-      </w:r>
-    </w:p>
-    <w:p>
-      <w:pPr>
-        <w:pStyle w:val="BodyText"/>
-      </w:pPr>
-      <w:r>
-        <w:t>Given the Chord Finder system has maintained chord formulas When the user submits C C G Then the system validates the submitted notes And the system does not identify a matching chord And the system displays a no matching chord message</w:t>
-      </w:r>
-    </w:p>
-    <w:p>
-      <w:pPr>
-        <w:pStyle w:val="BodyText"/>
-      </w:pPr>
-      <w:r>
-        <w:t>Scenario: Identify chord using flat note spelling</w:t>
-      </w:r>
-    </w:p>
-    <w:p>
-      <w:pPr>
-        <w:pStyle w:val="BodyText"/>
-      </w:pPr>
-      <w:r>
-        <w:t>Given the Chord Finder system has a maintained major chord formula When the user submits Db F Ab Then the system validates the submitted notes And the system identifies Db as a matching chord</w:t>
-      </w:r>
-    </w:p>
-    <w:p>
-      <w:pPr>
-        <w:pStyle w:val="BodyText"/>
-      </w:pPr>
-      <w:r>
-        <w:t>Scenario: Identify chord using sharp note spelling</w:t>
-      </w:r>
-    </w:p>
-    <w:p>
-      <w:pPr>
-        <w:pStyle w:val="BodyText"/>
-      </w:pPr>
-      <w:r>
-        <w:t>Given the Chord Finder system has a maintained major chord formula When the user submits C# F G# Then the system validates the submitted notes And the system identifies C# as a matching chord</w:t>
-      </w:r>
-    </w:p>
-    <w:p>
-      <w:pPr>
-        <w:pStyle w:val="BodyText"/>
-      </w:pPr>
-      <w:r>
-        <w:t>Scenario: View maintained chord formula list</w:t>
-      </w:r>
-    </w:p>
-    <w:p>
-      <w:pPr>
-        <w:pStyle w:val="BodyText"/>
-      </w:pPr>
-      <w:r>
-        <w:t>Given the administrator is maintaining chord formulas When the administrator selects view chord formulas Then the system retrieves the maintained chord formulas And the system displays the chord formula list</w:t>
-      </w:r>
-    </w:p>
-    <w:p>
-      <w:pPr>
-        <w:pStyle w:val="BodyText"/>
-      </w:pPr>
-      <w:r>
-        <w:t>Scenario: View newly added formula in formula list</w:t>
-      </w:r>
-    </w:p>
-    <w:p>
-      <w:pPr>
-        <w:pStyle w:val="BodyText"/>
-      </w:pPr>
-      <w:r>
-        <w:t>Given the administrator has added a suspended fourth formula When the administrator views maintained chord formulas Then the system displays the suspended fourth formula in the chord formula list</w:t>
-      </w:r>
-    </w:p>
-    <w:p>
-      <w:pPr>
-        <w:pStyle w:val="BodyText"/>
-      </w:pPr>
-      <w:r>
-        <w:t>Scenario: Confirm deleted formula is removed from list</w:t>
-      </w:r>
-    </w:p>
-    <w:p>
-      <w:pPr>
-        <w:pStyle w:val="BodyText"/>
-      </w:pPr>
-      <w:r>
-        <w:t>Given the administrator has deleted the minor chord formula When the administrator views maintained chord formulas Then the system does not display the minor chord formula in the chord formula list</w:t>
-      </w:r>
-    </w:p>
-    <w:p>
-      <w:pPr>
-        <w:pStyle w:val="BodyText"/>
-      </w:pPr>
-      <w:r>
-        <w:t>Scenario: Identify chord using newly added formula</w:t>
-      </w:r>
-    </w:p>
-    <w:p>
-      <w:pPr>
-        <w:pStyle w:val="BodyText"/>
-      </w:pPr>
-      <w:r>
-        <w:t>Given the administrator has added a suspended fourth formula When the user submits C F G Then the system validates the submitted notes And the system identifies Csus4 as a matching chord</w:t>
-      </w:r>
-    </w:p>
-    <w:p>
-      <w:pPr>
-        <w:pStyle w:val="BodyText"/>
-      </w:pPr>
-      <w:r>
-        <w:t>Scenario: Removed formula is no longer used</w:t>
-      </w:r>
-    </w:p>
-    <w:p>
-      <w:pPr>
-        <w:pStyle w:val="BodyText"/>
-      </w:pPr>
-      <w:r>
-        <w:lastRenderedPageBreak/>
-        <w:t>Given the administrator has deleted the minor chord formula When the user submits C Eb G Then the system validates the submitted notes And the system does not identify C minor</w:t>
-      </w:r>
-    </w:p>
-    <w:p>
-      <w:pPr>
-        <w:pStyle w:val="BodyText"/>
-      </w:pPr>
-      <w:r>
-        <w:t>Scenario: Updated formula changes chord matching</w:t>
-      </w:r>
-    </w:p>
-    <w:p>
-      <w:pPr>
-        <w:pStyle w:val="BodyText"/>
-      </w:pPr>
-      <w:r>
-        <w:t>Given the administrator has edited an existing chord formula When the user submits notes that match the updated formula Then the system uses the updated formula during chord identification And the system returns the matching chord result</w:t>
-      </w:r>
-    </w:p>
-    <w:p>
-      <w:pPr>
-        <w:pStyle w:val="BodyText"/>
-      </w:pPr>
-      <w:r>
-        <w:t>Scenario: Display formula not found when editing</w:t>
-      </w:r>
-    </w:p>
-    <w:p>
-      <w:pPr>
-        <w:pStyle w:val="BodyText"/>
-      </w:pPr>
-      <w:r>
-        <w:t>Given the administrator is maintaining chord formulas When the administrator tries to edit a formula that does not exist Then the system does not update the ChordFormulaCatalog And the system displays a formula not found message</w:t>
-      </w:r>
-    </w:p>
-    <w:p>
-      <w:pPr>
-        <w:pStyle w:val="BodyText"/>
-      </w:pPr>
-      <w:r>
-        <w:t>Scenario: Display formula not found when deleting</w:t>
-      </w:r>
-    </w:p>
-    <w:p>
-      <w:pPr>
-        <w:pStyle w:val="BodyText"/>
-      </w:pPr>
-      <w:r>
-        <w:t>Given the administrator is maintaining chord formulas When the administrator tries to delete a formula that does not exist Then the system does not update the ChordFormulaCatalog And the system displays a formula not found message</w:t>
-      </w:r>
-    </w:p>
-    <w:p>
-      <w:pPr>
-        <w:pStyle w:val="Heading2"/>
-      </w:pPr>
-      <w:bookmarkStart w:id="21" w:name="tdd-traceability-to-methods"/>
-      <w:bookmarkEnd w:id="19"/>
-      <w:bookmarkEnd w:id="20"/>
-      <w:r>
-        <w:t>TDD Traceability to Methods</w:t>
-      </w:r>
-    </w:p>
-    <w:p>
-      <w:pPr>
-        <w:pStyle w:val="FirstParagraph"/>
-      </w:pPr>
-      <w:r>
-        <w:t>TDD was used to test the individual methods and classes that implement the system behavior. The unit tests verify note validation, pitch position mapping, interval calculation, formula matching, chord identification, no-match handling, and administrator formula maintenance.</w:t>
-      </w:r>
-    </w:p>
-    <w:p>
-      <w:pPr>
-        <w:pStyle w:val="Heading2"/>
-      </w:pPr>
-      <w:bookmarkStart w:id="22" w:name="class-method-tdd-test"/>
-      <w:bookmarkEnd w:id="21"/>
-      <w:r>
-        <w:t>Class / Method TDD Test</w:t>
-      </w:r>
-    </w:p>
-    <w:p>
-      <w:pPr>
-        <w:pStyle w:val="FirstParagraph"/>
-      </w:pPr>
-      <w:r>
-        <w:t>ChordFinderSystem.identifyChord() shouldIdentifyMajorChord</w:t>
-      </w:r>
-    </w:p>
-    <w:p>
-      <w:pPr>
-        <w:pStyle w:val="BodyText"/>
-      </w:pPr>
-      <w:r>
-        <w:t>ChordFinderSystem.identifyChord() shouldIdentifyMinorChord</w:t>
-      </w:r>
-    </w:p>
-    <w:p>
-      <w:pPr>
-        <w:pStyle w:val="BodyText"/>
-      </w:pPr>
-      <w:r>
-        <w:t>ChordFinderSystem.identifyChord() shouldReturnEmptyListForNoMatchingChord</w:t>
-      </w:r>
-    </w:p>
-    <w:p>
-      <w:pPr>
-        <w:pStyle w:val="BodyText"/>
-      </w:pPr>
-      <w:r>
-        <w:t>ChordFinderSystem.identifyChord() shouldUseNewFormulaAfterAdministratorDefinesFormula</w:t>
-      </w:r>
-    </w:p>
-    <w:p>
-      <w:pPr>
-        <w:pStyle w:val="BodyText"/>
-      </w:pPr>
-      <w:r>
-        <w:t>ChordFinderSystem.identifyChord() shouldNotUseFormulaAfterAdministratorDeletesFormula</w:t>
-      </w:r>
-    </w:p>
-    <w:p>
-      <w:pPr>
-        <w:pStyle w:val="BodyText"/>
-      </w:pPr>
-      <w:r>
-        <w:t>ChordFinderSystem.validateNotes() shouldRejectFewerThanThreeNotes</w:t>
-      </w:r>
-    </w:p>
-    <w:p>
-      <w:pPr>
-        <w:pStyle w:val="BodyText"/>
-      </w:pPr>
-      <w:r>
-        <w:t>ChordFinderSystem.validateNotes() shouldRejectMoreThanThreeNotes</w:t>
-      </w:r>
-    </w:p>
-    <w:p>
-      <w:pPr>
-        <w:pStyle w:val="BodyText"/>
-      </w:pPr>
-      <w:r>
-        <w:t>ChordFinderSystem.validateNotes() shouldRejectInvalidNoteSpelling</w:t>
-      </w:r>
-    </w:p>
-    <w:p>
-      <w:pPr>
-        <w:pStyle w:val="BodyText"/>
-      </w:pPr>
-      <w:r>
-        <w:t>ChordFinderSystem.defineChordFormula() shouldUseNewFormulaAfterAdministratorDefinesFormula</w:t>
-      </w:r>
-    </w:p>
-    <w:p>
-      <w:pPr>
-        <w:pStyle w:val="BodyText"/>
-      </w:pPr>
-      <w:r>
-        <w:lastRenderedPageBreak/>
-        <w:t>ChordFinderSystem.deleteChordFormula() shouldNotUseFormulaAfterAdministratorDeletesFormula</w:t>
-      </w:r>
-    </w:p>
-    <w:p>
-      <w:pPr>
-        <w:pStyle w:val="BodyText"/>
-      </w:pPr>
-      <w:r>
-        <w:t>ChordFormulaCatalog.getChordFormulas() shouldStartWithDefaultFormulas</w:t>
-      </w:r>
-    </w:p>
-    <w:p>
-      <w:pPr>
-        <w:pStyle w:val="BodyText"/>
-      </w:pPr>
-      <w:r>
-        <w:t>ChordFormulaCatalog.defineChordFormula() shouldDefineNewFormula</w:t>
-      </w:r>
-    </w:p>
-    <w:p>
-      <w:pPr>
-        <w:pStyle w:val="BodyText"/>
-      </w:pPr>
-      <w:r>
-        <w:t>ChordFormulaCatalog.editChordFormula() shouldEditExistingFormula</w:t>
-      </w:r>
-    </w:p>
-    <w:p>
-      <w:pPr>
-        <w:pStyle w:val="BodyText"/>
-      </w:pPr>
-      <w:r>
-        <w:t>ChordFormulaCatalog.deleteChordFormula() shouldDeleteExistingFormula</w:t>
-      </w:r>
-    </w:p>
-    <w:p>
-      <w:pPr>
-        <w:pStyle w:val="BodyText"/>
-      </w:pPr>
-      <w:r>
-        <w:t>ChordFormulaCatalog.findFormula() shouldEditExistingFormula</w:t>
-      </w:r>
-    </w:p>
-    <w:p>
-      <w:pPr>
-        <w:pStyle w:val="BodyText"/>
-      </w:pPr>
-      <w:r>
-        <w:t>ChordFormula.matchesNotes() majorFormulaShouldMatchMajorTriad</w:t>
-      </w:r>
-    </w:p>
-    <w:p>
-      <w:pPr>
-        <w:pStyle w:val="BodyText"/>
-      </w:pPr>
-      <w:r>
-        <w:t>ChordFormula.matchesNotes() minorFormulaShouldMatchMinorTriad</w:t>
-      </w:r>
-    </w:p>
-    <w:p>
-      <w:pPr>
-        <w:pStyle w:val="BodyText"/>
-      </w:pPr>
-      <w:r>
-        <w:t>ChordFormula.matchesNotes() majorFormulaShouldNotMatchMinorTriad</w:t>
-      </w:r>
-    </w:p>
-    <w:p>
-      <w:pPr>
-        <w:pStyle w:val="BodyText"/>
-      </w:pPr>
-      <w:r>
-        <w:t>ChordFormula.updateFormula() updateFormulaShouldReviseFormulaValues</w:t>
-      </w:r>
-    </w:p>
-    <w:p>
-      <w:pPr>
-        <w:pStyle w:val="BodyText"/>
-      </w:pPr>
-      <w:r>
-        <w:t>Note.from() shouldCreateValidNaturalNote</w:t>
-      </w:r>
-    </w:p>
-    <w:p>
-      <w:pPr>
-        <w:pStyle w:val="BodyText"/>
-      </w:pPr>
-      <w:r>
-        <w:t>Note.from() shouldCreateValidSharpNote</w:t>
-      </w:r>
-    </w:p>
-    <w:p>
-      <w:pPr>
-        <w:pStyle w:val="BodyText"/>
-      </w:pPr>
-      <w:r>
-        <w:t>Note.from() shouldCreateValidFlatNote</w:t>
-      </w:r>
-    </w:p>
-    <w:p>
-      <w:pPr>
-        <w:pStyle w:val="BodyText"/>
-      </w:pPr>
-      <w:r>
-        <w:t>Note.isValid() shouldRejectInvalidNoteText</w:t>
-      </w:r>
-    </w:p>
-    <w:p>
-      <w:pPr>
-        <w:pStyle w:val="BodyText"/>
-      </w:pPr>
-      <w:r>
-        <w:t>Note.distanceTo() shouldCalculateDistanceForward</w:t>
-      </w:r>
-    </w:p>
-    <w:p>
-      <w:pPr>
-        <w:pStyle w:val="BodyText"/>
-      </w:pPr>
-      <w:r>
-        <w:t>Note.distanceTo() shouldCalculateDistanceAcrossOctave</w:t>
-      </w:r>
-    </w:p>
-    <w:p>
-      <w:pPr>
-        <w:pStyle w:val="Heading3"/>
-      </w:pPr>
-      <w:bookmarkStart w:id="23" w:name="traceability-summary"/>
+      <w:bookmarkStart w:id="18" w:name="traceability-summary"/>
       <w:r>
         <w:t>Traceability Summary</w:t>
       </w:r>
@@ -4486,102 +5403,120 @@
       <w:pPr>
         <w:pStyle w:val="Heading2"/>
       </w:pPr>
-      <w:bookmarkStart w:id="24" w:name="installation"/>
-      <w:bookmarkEnd w:id="22"/>
-      <w:bookmarkEnd w:id="23"/>
+      <w:bookmarkStart w:id="19" w:name="installation"/>
+      <w:bookmarkEnd w:id="17"/>
+      <w:bookmarkEnd w:id="18"/>
+      <w:r>
+        <w:t>Installation</w:t>
+      </w:r>
+    </w:p>
+    <w:p>
+      <w:pPr>
+        <w:pStyle w:val="Heading3"/>
+      </w:pPr>
+      <w:bookmarkStart w:id="20" w:name="prerequisites"/>
+      <w:r>
+        <w:t>Prerequisites</w:t>
+      </w:r>
+    </w:p>
+    <w:p>
+      <w:pPr>
+        <w:pStyle w:val="FirstParagraph"/>
+      </w:pPr>
+      <w:r>
+        <w:t>Before running the application, make sure the following software is installed:</w:t>
+      </w:r>
+    </w:p>
+    <w:p>
+      <w:pPr>
+        <w:pStyle w:val="Compact"/>
+        <w:numPr>
+          <w:ilvl w:val="0"/>
+          <w:numId w:val="18"/>
+        </w:numPr>
+      </w:pPr>
+      <w:r>
+        <w:t>Java Development Kit (JDK) 25 or later</w:t>
+      </w:r>
+    </w:p>
+    <w:p>
+      <w:pPr>
+        <w:pStyle w:val="Compact"/>
+        <w:numPr>
+          <w:ilvl w:val="0"/>
+          <w:numId w:val="18"/>
+        </w:numPr>
+      </w:pPr>
+      <w:r>
+        <w:t>Maven</w:t>
+      </w:r>
+    </w:p>
+    <w:p>
+      <w:pPr>
+        <w:pStyle w:val="Compact"/>
+        <w:numPr>
+          <w:ilvl w:val="0"/>
+          <w:numId w:val="18"/>
+        </w:numPr>
+      </w:pPr>
+      <w:r>
+        <w:t>Git</w:t>
+      </w:r>
+    </w:p>
+    <w:p>
+      <w:pPr>
+        <w:pStyle w:val="Compact"/>
+        <w:numPr>
+          <w:ilvl w:val="0"/>
+          <w:numId w:val="18"/>
+        </w:numPr>
+      </w:pPr>
+      <w:r>
+        <w:t>Eclipse, IntelliJ IDEA, VS Code, or another Java-compatible IDE</w:t>
+      </w:r>
+    </w:p>
+    <w:p>
+      <w:pPr>
+        <w:pStyle w:val="Heading3"/>
+      </w:pPr>
+      <w:bookmarkStart w:id="21" w:name="clone-the-project"/>
+      <w:bookmarkEnd w:id="20"/>
+      <w:r>
+        <w:t>Clone the Project</w:t>
+      </w:r>
+    </w:p>
+    <w:p>
+      <w:pPr>
+        <w:pStyle w:val="FirstParagraph"/>
+      </w:pPr>
+      <w:r>
+        <w:t xml:space="preserve">git clone https://github.com/theReal4m4d3u5/chordFinder.git </w:t>
+      </w:r>
+    </w:p>
+    <w:p>
+      <w:pPr>
+        <w:pStyle w:val="FirstParagraph"/>
+      </w:pPr>
+      <w:r>
+        <w:t xml:space="preserve">cd </w:t>
+      </w:r>
+      <w:proofErr w:type="spellStart"/>
+      <w:r>
+        <w:t>chordFinder</w:t>
+      </w:r>
+      <w:proofErr w:type="spellEnd"/>
+    </w:p>
+    <w:p>
+      <w:r>
+        <w:br w:type="page"/>
+      </w:r>
+    </w:p>
+    <w:p>
+      <w:pPr>
+        <w:pStyle w:val="BodyText"/>
+      </w:pPr>
       <w:r>
         <w:lastRenderedPageBreak/>
-        <w:t>Installation</w:t>
-      </w:r>
-    </w:p>
-    <w:p>
-      <w:pPr>
-        <w:pStyle w:val="Heading3"/>
-      </w:pPr>
-      <w:bookmarkStart w:id="25" w:name="prerequisites"/>
-      <w:r>
-        <w:t>Prerequisites</w:t>
-      </w:r>
-    </w:p>
-    <w:p>
-      <w:pPr>
-        <w:pStyle w:val="FirstParagraph"/>
-      </w:pPr>
-      <w:r>
-        <w:t>Before running the application, make sure the following software is installed:</w:t>
-      </w:r>
-    </w:p>
-    <w:p>
-      <w:pPr>
-        <w:pStyle w:val="Compact"/>
-        <w:numPr>
-          <w:ilvl w:val="0"/>
-          <w:numId w:val="20"/>
-        </w:numPr>
-      </w:pPr>
-      <w:r>
-        <w:t>Java Development Kit (JDK) 25 or later</w:t>
-      </w:r>
-    </w:p>
-    <w:p>
-      <w:pPr>
-        <w:pStyle w:val="Compact"/>
-        <w:numPr>
-          <w:ilvl w:val="0"/>
-          <w:numId w:val="20"/>
-        </w:numPr>
-      </w:pPr>
-      <w:r>
-        <w:t>Maven</w:t>
-      </w:r>
-    </w:p>
-    <w:p>
-      <w:pPr>
-        <w:pStyle w:val="Compact"/>
-        <w:numPr>
-          <w:ilvl w:val="0"/>
-          <w:numId w:val="20"/>
-        </w:numPr>
-      </w:pPr>
-      <w:r>
-        <w:t>Git</w:t>
-      </w:r>
-    </w:p>
-    <w:p>
-      <w:pPr>
-        <w:pStyle w:val="Compact"/>
-        <w:numPr>
-          <w:ilvl w:val="0"/>
-          <w:numId w:val="20"/>
-        </w:numPr>
-      </w:pPr>
-      <w:r>
-        <w:t>Eclipse, IntelliJ IDEA, VS Code, or another Java-compatible IDE</w:t>
-      </w:r>
-    </w:p>
-    <w:p>
-      <w:pPr>
-        <w:pStyle w:val="Heading3"/>
-      </w:pPr>
-      <w:bookmarkStart w:id="26" w:name="clone-the-project"/>
-      <w:bookmarkEnd w:id="25"/>
-      <w:r>
-        <w:t>Clone the Project</w:t>
-      </w:r>
-    </w:p>
-    <w:p>
-      <w:pPr>
-        <w:pStyle w:val="FirstParagraph"/>
-      </w:pPr>
-      <w:r>
-        <w:t>```bash git clone https://github.com/theReal4m4d3u5/chordFinder.git cd chordFinder</w:t>
-      </w:r>
-    </w:p>
-    <w:p>
-      <w:pPr>
-        <w:pStyle w:val="BodyText"/>
-      </w:pPr>
-      <w:r>
         <w:t>AI Usage</w:t>
       </w:r>
     </w:p>
@@ -4593,8 +5528,8 @@
         <w:t>https://chatgpt.com/share/6a4d5075-e3fc-83ea-8b90-b8567e334af5 https://chatgpt.com/share/6a4d508a-0a34-83ea-99c7-3d1ed0573ca2 https://chatgpt.com/share/6a4d5016-b5cc-83ea-97f3-6aa9f517b3b5 https://chatgpt.com/share/6a4d501f-b268-83ea-b293-9234df955686 https://chatgpt.com/share/6a4d502b-d94c-83ea-bc93-40185a049fcb https://chatgpt.com/share/6a4d502b-d94c-83ea-bc93-40185a049fcb https://chatgpt.com/share/6a4d5042-7b5c-83ea-8017-0e97c48a1b9c https://chatgpt.com/share/6a4d504f-0cec-83ea-9adc-cc4dc328d059 https://chatgpt.com/share/6a4d5062-4d78-83ea-88aa-3a5a932f2621 https://chatgpt.com/share/6a4d506d-5f78-83ea-a6b4-e6be2b1d8817</w:t>
       </w:r>
       <w:bookmarkEnd w:id="0"/>
-      <w:bookmarkEnd w:id="24"/>
-      <w:bookmarkEnd w:id="26"/>
+      <w:bookmarkEnd w:id="19"/>
+      <w:bookmarkEnd w:id="21"/>
     </w:p>
     <w:sectPr>
       <w:footnotePr>
@@ -4613,7 +5548,7 @@
   <w:abstractNum w:abstractNumId="0" w15:restartNumberingAfterBreak="0">
     <w:nsid w:val="0000A990"/>
     <w:multiLevelType w:val="multilevel"/>
-    <w:tmpl w:val="723CF0CE"/>
+    <w:tmpl w:val="46A45650"/>
     <w:lvl w:ilvl="0">
       <w:numFmt w:val="bullet"/>
       <w:lvlText w:val=" "/>
@@ -4690,7 +5625,7 @@
   <w:abstractNum w:abstractNumId="1" w15:restartNumberingAfterBreak="0">
     <w:nsid w:val="0000A991"/>
     <w:multiLevelType w:val="multilevel"/>
-    <w:tmpl w:val="39D61676"/>
+    <w:tmpl w:val="A6E655D6"/>
     <w:lvl w:ilvl="0">
       <w:numFmt w:val="bullet"/>
       <w:lvlText w:val=""/>
@@ -4794,7 +5729,7 @@
   <w:abstractNum w:abstractNumId="2" w15:restartNumberingAfterBreak="0">
     <w:nsid w:val="00A99411"/>
     <w:multiLevelType w:val="multilevel"/>
-    <w:tmpl w:val="EC3C67BE"/>
+    <w:tmpl w:val="02409188"/>
     <w:lvl w:ilvl="0">
       <w:start w:val="1"/>
       <w:numFmt w:val="decimal"/>
@@ -4877,61 +5812,55 @@
       </w:pPr>
     </w:lvl>
   </w:abstractNum>
-  <w:num w:numId="1" w16cid:durableId="426508581">
+  <w:num w:numId="1" w16cid:durableId="1900282495">
     <w:abstractNumId w:val="0"/>
   </w:num>
-  <w:num w:numId="2" w16cid:durableId="1301114826">
+  <w:num w:numId="2" w16cid:durableId="435449063">
     <w:abstractNumId w:val="1"/>
   </w:num>
-  <w:num w:numId="3" w16cid:durableId="1502308440">
+  <w:num w:numId="3" w16cid:durableId="1592735186">
     <w:abstractNumId w:val="1"/>
   </w:num>
-  <w:num w:numId="4" w16cid:durableId="1354720523">
+  <w:num w:numId="4" w16cid:durableId="934677958">
     <w:abstractNumId w:val="1"/>
   </w:num>
-  <w:num w:numId="5" w16cid:durableId="1050180562">
+  <w:num w:numId="5" w16cid:durableId="1265728531">
     <w:abstractNumId w:val="1"/>
   </w:num>
-  <w:num w:numId="6" w16cid:durableId="1459225631">
+  <w:num w:numId="6" w16cid:durableId="1458719583">
     <w:abstractNumId w:val="1"/>
   </w:num>
-  <w:num w:numId="7" w16cid:durableId="176967377">
+  <w:num w:numId="7" w16cid:durableId="1120686746">
     <w:abstractNumId w:val="1"/>
   </w:num>
-  <w:num w:numId="8" w16cid:durableId="213735487">
+  <w:num w:numId="8" w16cid:durableId="1840074597">
     <w:abstractNumId w:val="1"/>
   </w:num>
-  <w:num w:numId="9" w16cid:durableId="1444417025">
+  <w:num w:numId="9" w16cid:durableId="1924603932">
     <w:abstractNumId w:val="1"/>
   </w:num>
-  <w:num w:numId="10" w16cid:durableId="1944920054">
+  <w:num w:numId="10" w16cid:durableId="1498812983">
     <w:abstractNumId w:val="1"/>
   </w:num>
-  <w:num w:numId="11" w16cid:durableId="1325402939">
+  <w:num w:numId="11" w16cid:durableId="1368531080">
     <w:abstractNumId w:val="1"/>
   </w:num>
-  <w:num w:numId="12" w16cid:durableId="414671010">
+  <w:num w:numId="12" w16cid:durableId="259611033">
     <w:abstractNumId w:val="1"/>
   </w:num>
-  <w:num w:numId="13" w16cid:durableId="482358929">
+  <w:num w:numId="13" w16cid:durableId="1274702992">
     <w:abstractNumId w:val="1"/>
   </w:num>
-  <w:num w:numId="14" w16cid:durableId="1838184604">
+  <w:num w:numId="14" w16cid:durableId="634067850">
     <w:abstractNumId w:val="1"/>
   </w:num>
-  <w:num w:numId="15" w16cid:durableId="1118833782">
+  <w:num w:numId="15" w16cid:durableId="1235043538">
     <w:abstractNumId w:val="1"/>
   </w:num>
-  <w:num w:numId="16" w16cid:durableId="2115779350">
+  <w:num w:numId="16" w16cid:durableId="572592264">
     <w:abstractNumId w:val="1"/>
   </w:num>
-  <w:num w:numId="17" w16cid:durableId="2068138403">
-    <w:abstractNumId w:val="1"/>
-  </w:num>
-  <w:num w:numId="18" w16cid:durableId="336150237">
-    <w:abstractNumId w:val="1"/>
-  </w:num>
-  <w:num w:numId="19" w16cid:durableId="585263071">
+  <w:num w:numId="17" w16cid:durableId="538010918">
     <w:abstractNumId w:val="2"/>
     <w:lvlOverride w:ilvl="0">
       <w:startOverride w:val="1"/>
@@ -4961,7 +5890,7 @@
       <w:startOverride w:val="1"/>
     </w:lvlOverride>
   </w:num>
-  <w:num w:numId="20" w16cid:durableId="1813985933">
+  <w:num w:numId="18" w16cid:durableId="2011788746">
     <w:abstractNumId w:val="1"/>
   </w:num>
 </w:numbering>

</xml_diff>

<commit_message>
Add BDD coverage for rebuilt chord formula catalog
</commit_message>
<xml_diff>
--- a/chordFinderMidTermAveryJacobson.docx
+++ b/chordFinderMidTermAveryJacobson.docx
@@ -602,7 +602,7 @@
         </w:trPr>
         <w:tc>
           <w:tcPr>
-            <w:tcW w:w="2640" w:type="dxa"/>
+            <w:tcW w:w="3192" w:type="dxa"/>
           </w:tcPr>
           <w:p>
             <w:pPr>
@@ -615,7 +615,7 @@
         </w:tc>
         <w:tc>
           <w:tcPr>
-            <w:tcW w:w="2640" w:type="dxa"/>
+            <w:tcW w:w="3192" w:type="dxa"/>
           </w:tcPr>
           <w:p>
             <w:pPr>
@@ -628,7 +628,7 @@
         </w:tc>
         <w:tc>
           <w:tcPr>
-            <w:tcW w:w="2640" w:type="dxa"/>
+            <w:tcW w:w="3192" w:type="dxa"/>
           </w:tcPr>
           <w:p>
             <w:pPr>
@@ -643,7 +643,7 @@
       <w:tr>
         <w:tc>
           <w:tcPr>
-            <w:tcW w:w="2640" w:type="dxa"/>
+            <w:tcW w:w="3192" w:type="dxa"/>
           </w:tcPr>
           <w:p>
             <w:pPr>
@@ -656,7 +656,7 @@
         </w:tc>
         <w:tc>
           <w:tcPr>
-            <w:tcW w:w="2640" w:type="dxa"/>
+            <w:tcW w:w="3192" w:type="dxa"/>
           </w:tcPr>
           <w:p>
             <w:pPr>
@@ -669,7 +669,7 @@
         </w:tc>
         <w:tc>
           <w:tcPr>
-            <w:tcW w:w="2640" w:type="dxa"/>
+            <w:tcW w:w="3192" w:type="dxa"/>
           </w:tcPr>
           <w:p>
             <w:pPr>
@@ -684,7 +684,7 @@
       <w:tr>
         <w:tc>
           <w:tcPr>
-            <w:tcW w:w="2640" w:type="dxa"/>
+            <w:tcW w:w="3192" w:type="dxa"/>
           </w:tcPr>
           <w:p>
             <w:pPr>
@@ -697,7 +697,7 @@
         </w:tc>
         <w:tc>
           <w:tcPr>
-            <w:tcW w:w="2640" w:type="dxa"/>
+            <w:tcW w:w="3192" w:type="dxa"/>
           </w:tcPr>
           <w:p>
             <w:pPr>
@@ -710,7 +710,7 @@
         </w:tc>
         <w:tc>
           <w:tcPr>
-            <w:tcW w:w="2640" w:type="dxa"/>
+            <w:tcW w:w="3192" w:type="dxa"/>
           </w:tcPr>
           <w:p>
             <w:pPr>
@@ -725,7 +725,7 @@
       <w:tr>
         <w:tc>
           <w:tcPr>
-            <w:tcW w:w="2640" w:type="dxa"/>
+            <w:tcW w:w="3192" w:type="dxa"/>
           </w:tcPr>
           <w:p>
             <w:pPr>
@@ -738,7 +738,7 @@
         </w:tc>
         <w:tc>
           <w:tcPr>
-            <w:tcW w:w="2640" w:type="dxa"/>
+            <w:tcW w:w="3192" w:type="dxa"/>
           </w:tcPr>
           <w:p>
             <w:pPr>
@@ -751,7 +751,7 @@
         </w:tc>
         <w:tc>
           <w:tcPr>
-            <w:tcW w:w="2640" w:type="dxa"/>
+            <w:tcW w:w="3192" w:type="dxa"/>
           </w:tcPr>
           <w:p>
             <w:pPr>
@@ -766,7 +766,7 @@
       <w:tr>
         <w:tc>
           <w:tcPr>
-            <w:tcW w:w="2640" w:type="dxa"/>
+            <w:tcW w:w="3192" w:type="dxa"/>
           </w:tcPr>
           <w:p>
             <w:pPr>
@@ -780,7 +780,7 @@
         </w:tc>
         <w:tc>
           <w:tcPr>
-            <w:tcW w:w="2640" w:type="dxa"/>
+            <w:tcW w:w="3192" w:type="dxa"/>
           </w:tcPr>
           <w:p>
             <w:pPr>
@@ -793,7 +793,7 @@
         </w:tc>
         <w:tc>
           <w:tcPr>
-            <w:tcW w:w="2640" w:type="dxa"/>
+            <w:tcW w:w="3192" w:type="dxa"/>
           </w:tcPr>
           <w:p>
             <w:pPr>
@@ -808,7 +808,7 @@
       <w:tr>
         <w:tc>
           <w:tcPr>
-            <w:tcW w:w="2640" w:type="dxa"/>
+            <w:tcW w:w="3192" w:type="dxa"/>
           </w:tcPr>
           <w:p>
             <w:pPr>
@@ -821,7 +821,7 @@
         </w:tc>
         <w:tc>
           <w:tcPr>
-            <w:tcW w:w="2640" w:type="dxa"/>
+            <w:tcW w:w="3192" w:type="dxa"/>
           </w:tcPr>
           <w:p>
             <w:pPr>
@@ -834,7 +834,7 @@
         </w:tc>
         <w:tc>
           <w:tcPr>
-            <w:tcW w:w="2640" w:type="dxa"/>
+            <w:tcW w:w="3192" w:type="dxa"/>
           </w:tcPr>
           <w:p>
             <w:pPr>
@@ -849,7 +849,7 @@
       <w:tr>
         <w:tc>
           <w:tcPr>
-            <w:tcW w:w="2640" w:type="dxa"/>
+            <w:tcW w:w="3192" w:type="dxa"/>
           </w:tcPr>
           <w:p>
             <w:pPr>
@@ -862,7 +862,7 @@
         </w:tc>
         <w:tc>
           <w:tcPr>
-            <w:tcW w:w="2640" w:type="dxa"/>
+            <w:tcW w:w="3192" w:type="dxa"/>
           </w:tcPr>
           <w:p>
             <w:pPr>
@@ -875,7 +875,7 @@
         </w:tc>
         <w:tc>
           <w:tcPr>
-            <w:tcW w:w="2640" w:type="dxa"/>
+            <w:tcW w:w="3192" w:type="dxa"/>
           </w:tcPr>
           <w:p>
             <w:pPr>
@@ -890,7 +890,7 @@
       <w:tr>
         <w:tc>
           <w:tcPr>
-            <w:tcW w:w="2640" w:type="dxa"/>
+            <w:tcW w:w="3192" w:type="dxa"/>
           </w:tcPr>
           <w:p>
             <w:pPr>
@@ -903,7 +903,7 @@
         </w:tc>
         <w:tc>
           <w:tcPr>
-            <w:tcW w:w="2640" w:type="dxa"/>
+            <w:tcW w:w="3192" w:type="dxa"/>
           </w:tcPr>
           <w:p>
             <w:pPr>
@@ -920,7 +920,7 @@
         </w:tc>
         <w:tc>
           <w:tcPr>
-            <w:tcW w:w="2640" w:type="dxa"/>
+            <w:tcW w:w="3192" w:type="dxa"/>
           </w:tcPr>
           <w:p>
             <w:pPr>
@@ -936,7 +936,7 @@
       <w:tr>
         <w:tc>
           <w:tcPr>
-            <w:tcW w:w="2640" w:type="dxa"/>
+            <w:tcW w:w="3192" w:type="dxa"/>
           </w:tcPr>
           <w:p>
             <w:pPr>
@@ -949,7 +949,7 @@
         </w:tc>
         <w:tc>
           <w:tcPr>
-            <w:tcW w:w="2640" w:type="dxa"/>
+            <w:tcW w:w="3192" w:type="dxa"/>
           </w:tcPr>
           <w:p>
             <w:pPr>
@@ -962,7 +962,7 @@
         </w:tc>
         <w:tc>
           <w:tcPr>
-            <w:tcW w:w="2640" w:type="dxa"/>
+            <w:tcW w:w="3192" w:type="dxa"/>
           </w:tcPr>
           <w:p>
             <w:pPr>
@@ -977,7 +977,7 @@
       <w:tr>
         <w:tc>
           <w:tcPr>
-            <w:tcW w:w="2640" w:type="dxa"/>
+            <w:tcW w:w="3192" w:type="dxa"/>
           </w:tcPr>
           <w:p>
             <w:pPr>
@@ -990,7 +990,7 @@
         </w:tc>
         <w:tc>
           <w:tcPr>
-            <w:tcW w:w="2640" w:type="dxa"/>
+            <w:tcW w:w="3192" w:type="dxa"/>
           </w:tcPr>
           <w:p>
             <w:pPr>
@@ -1003,7 +1003,7 @@
         </w:tc>
         <w:tc>
           <w:tcPr>
-            <w:tcW w:w="2640" w:type="dxa"/>
+            <w:tcW w:w="3192" w:type="dxa"/>
           </w:tcPr>
           <w:p>
             <w:pPr>
@@ -1018,7 +1018,7 @@
       <w:tr>
         <w:tc>
           <w:tcPr>
-            <w:tcW w:w="2640" w:type="dxa"/>
+            <w:tcW w:w="3192" w:type="dxa"/>
           </w:tcPr>
           <w:p>
             <w:pPr>
@@ -1031,7 +1031,7 @@
         </w:tc>
         <w:tc>
           <w:tcPr>
-            <w:tcW w:w="2640" w:type="dxa"/>
+            <w:tcW w:w="3192" w:type="dxa"/>
           </w:tcPr>
           <w:p>
             <w:pPr>
@@ -1044,7 +1044,7 @@
         </w:tc>
         <w:tc>
           <w:tcPr>
-            <w:tcW w:w="2640" w:type="dxa"/>
+            <w:tcW w:w="3192" w:type="dxa"/>
           </w:tcPr>
           <w:p>
             <w:pPr>
@@ -1059,71 +1059,20 @@
       <w:tr>
         <w:tc>
           <w:tcPr>
-            <w:tcW w:w="2640" w:type="dxa"/>
+            <w:tcW w:w="3192" w:type="dxa"/>
           </w:tcPr>
           <w:p>
             <w:pPr>
               <w:pStyle w:val="Compact"/>
             </w:pPr>
             <w:r>
-              <w:t>Limit the first release to triads.</w:t>
-            </w:r>
-          </w:p>
-        </w:tc>
-        <w:tc>
-          <w:tcPr>
-            <w:tcW w:w="2640" w:type="dxa"/>
-          </w:tcPr>
-          <w:p>
-            <w:pPr>
-              <w:pStyle w:val="Compact"/>
-            </w:pPr>
-            <w:r>
-              <w:t xml:space="preserve">Considered whether ChordFormula should support seventh chords, inversions, voicings, or other advanced chord types immediately. Those features would make the system more powerful, but they would also add complexity beyond the client’s initial </w:t>
-            </w:r>
-            <w:r>
-              <w:lastRenderedPageBreak/>
-              <w:t>request.</w:t>
-            </w:r>
-          </w:p>
-        </w:tc>
-        <w:tc>
-          <w:tcPr>
-            <w:tcW w:w="2640" w:type="dxa"/>
-          </w:tcPr>
-          <w:p>
-            <w:pPr>
-              <w:pStyle w:val="Compact"/>
-            </w:pPr>
-            <w:r>
-              <w:lastRenderedPageBreak/>
-              <w:t xml:space="preserve">The client’s initial problem is focused on identifying three-note chords. Limiting the release to triads keeps the system small, understandable, and aligned with the stated requirements while still allowing formulas to be </w:t>
-            </w:r>
-            <w:r>
-              <w:lastRenderedPageBreak/>
-              <w:t>extended later.</w:t>
-            </w:r>
-          </w:p>
-        </w:tc>
-      </w:tr>
-      <w:tr>
-        <w:tc>
-          <w:tcPr>
-            <w:tcW w:w="2640" w:type="dxa"/>
-          </w:tcPr>
-          <w:p>
-            <w:pPr>
-              <w:pStyle w:val="Compact"/>
-            </w:pPr>
-            <w:r>
-              <w:lastRenderedPageBreak/>
               <w:t>Return all matching chord names when appropriate.</w:t>
             </w:r>
           </w:p>
         </w:tc>
         <w:tc>
           <w:tcPr>
-            <w:tcW w:w="2640" w:type="dxa"/>
+            <w:tcW w:w="3192" w:type="dxa"/>
           </w:tcPr>
           <w:p>
             <w:pPr>
@@ -1136,7 +1085,7 @@
         </w:tc>
         <w:tc>
           <w:tcPr>
-            <w:tcW w:w="2640" w:type="dxa"/>
+            <w:tcW w:w="3192" w:type="dxa"/>
           </w:tcPr>
           <w:p>
             <w:pPr>
@@ -1151,20 +1100,21 @@
       <w:tr>
         <w:tc>
           <w:tcPr>
-            <w:tcW w:w="2640" w:type="dxa"/>
+            <w:tcW w:w="3192" w:type="dxa"/>
           </w:tcPr>
           <w:p>
             <w:pPr>
               <w:pStyle w:val="Compact"/>
             </w:pPr>
             <w:r>
+              <w:lastRenderedPageBreak/>
               <w:t>Keep chord formulas as maintained system data.</w:t>
             </w:r>
           </w:p>
         </w:tc>
         <w:tc>
           <w:tcPr>
-            <w:tcW w:w="2640" w:type="dxa"/>
+            <w:tcW w:w="3192" w:type="dxa"/>
           </w:tcPr>
           <w:p>
             <w:pPr>
@@ -1177,7 +1127,7 @@
         </w:tc>
         <w:tc>
           <w:tcPr>
-            <w:tcW w:w="2640" w:type="dxa"/>
+            <w:tcW w:w="3192" w:type="dxa"/>
           </w:tcPr>
           <w:p>
             <w:pPr>
@@ -1192,7 +1142,7 @@
       <w:tr>
         <w:tc>
           <w:tcPr>
-            <w:tcW w:w="2640" w:type="dxa"/>
+            <w:tcW w:w="3192" w:type="dxa"/>
           </w:tcPr>
           <w:p>
             <w:pPr>
@@ -1205,7 +1155,7 @@
         </w:tc>
         <w:tc>
           <w:tcPr>
-            <w:tcW w:w="2640" w:type="dxa"/>
+            <w:tcW w:w="3192" w:type="dxa"/>
           </w:tcPr>
           <w:p>
             <w:pPr>
@@ -1218,7 +1168,7 @@
         </w:tc>
         <w:tc>
           <w:tcPr>
-            <w:tcW w:w="2640" w:type="dxa"/>
+            <w:tcW w:w="3192" w:type="dxa"/>
           </w:tcPr>
           <w:p>
             <w:pPr>
@@ -1233,7 +1183,7 @@
       <w:tr>
         <w:tc>
           <w:tcPr>
-            <w:tcW w:w="2640" w:type="dxa"/>
+            <w:tcW w:w="3192" w:type="dxa"/>
           </w:tcPr>
           <w:p>
             <w:pPr>
@@ -1246,36 +1196,27 @@
         </w:tc>
         <w:tc>
           <w:tcPr>
-            <w:tcW w:w="2640" w:type="dxa"/>
+            <w:tcW w:w="3192" w:type="dxa"/>
           </w:tcPr>
           <w:p>
             <w:pPr>
               <w:pStyle w:val="Compact"/>
             </w:pPr>
             <w:r>
-              <w:t xml:space="preserve">Considered whether ChordFinderSystem should simply associate with formulas or directly own them. Direct ownership by ChordFinderSystem would work, but it would weaken the purpose of the catalog and make formula management less clearly </w:t>
-            </w:r>
-            <w:r>
-              <w:lastRenderedPageBreak/>
-              <w:t>separated.</w:t>
+              <w:t>Considered whether ChordFinderSystem should simply associate with formulas or directly own them. Direct ownership by ChordFinderSystem would work, but it would weaken the purpose of the catalog and make formula management less clearly separated.</w:t>
             </w:r>
           </w:p>
         </w:tc>
         <w:tc>
           <w:tcPr>
-            <w:tcW w:w="2640" w:type="dxa"/>
+            <w:tcW w:w="3192" w:type="dxa"/>
           </w:tcPr>
           <w:p>
             <w:pPr>
               <w:pStyle w:val="Compact"/>
             </w:pPr>
             <w:r>
-              <w:lastRenderedPageBreak/>
-              <w:t xml:space="preserve">The catalog manages a collection of chord formulas, so aggregation best represents the whole-part relationship in this model. This shows that formulas belong to the maintained catalog and supports the design choice to keep formula maintenance separate from </w:t>
-            </w:r>
-            <w:r>
-              <w:lastRenderedPageBreak/>
-              <w:t>chord identification.</w:t>
+              <w:t>The catalog manages a collection of chord formulas, so aggregation best represents the whole-part relationship in this model. This shows that formulas belong to the maintained catalog and supports the design choice to keep formula maintenance separate from chord identification.</w:t>
             </w:r>
           </w:p>
         </w:tc>

</xml_diff>